<commit_message>
docs: Add detailed Challenges Encountered and Resolutions section to report and README
</commit_message>
<xml_diff>
--- a/report/report_week4.docx
+++ b/report/report_week4.docx
@@ -1632,7 +1632,147 @@
           <w:color w:val="1E3A8A"/>
           <w:sz w:val="32"/>
         </w:rPr>
-        <w:t>7. Audit Results &amp; Final Deliverables</w:t>
+        <w:t>7. Engineering Challenges Encountered &amp; Resolutions</w:t>
+      </w:r>
+    </w:p>
+    <w:p>
+      <w:pPr>
+        <w:spacing w:after="120" w:line="276" w:lineRule="auto"/>
+      </w:pPr>
+      <w:r>
+        <w:rPr>
+          <w:rFonts w:ascii="Calibri" w:hAnsi="Calibri"/>
+          <w:color w:val="374151"/>
+          <w:sz w:val="22"/>
+        </w:rPr>
+        <w:t>During the execution of the Week 4 Performance Optimization Challenge, several complex technical trade-offs were encountered and methodically solved:</w:t>
+      </w:r>
+    </w:p>
+    <w:p>
+      <w:pPr>
+        <w:pStyle w:val="Heading2"/>
+        <w:spacing w:before="200" w:after="80"/>
+      </w:pPr>
+      <w:r>
+        <w:rPr>
+          <w:rFonts w:ascii="Calibri" w:hAnsi="Calibri"/>
+          <w:b/>
+          <w:color w:val="2563EB"/>
+          <w:sz w:val="26"/>
+        </w:rPr>
+        <w:t>7.1 Challenge 1: Flash of Unstyled Content (FOUC) vs Critical Path Speed</w:t>
+      </w:r>
+    </w:p>
+    <w:p>
+      <w:pPr>
+        <w:spacing w:after="120" w:line="276" w:lineRule="auto"/>
+      </w:pPr>
+      <w:r>
+        <w:rPr>
+          <w:rFonts w:ascii="Calibri" w:hAnsi="Calibri"/>
+          <w:color w:val="374151"/>
+          <w:sz w:val="22"/>
+        </w:rPr>
+        <w:t>Deferring secondary stylesheets asynchronously can introduce a visual 'flash' when late-loading rules apply to rendered elements. To resolve this without sacrificing First Contentful Paint, the exact layout boundaries of all cards and sections were encoded into the inlined critical CSS (&lt; 8KB). A progressive &lt;noscript&gt; fallback was paired with rel='preload' as='style', ensuring seamless visual continuity and zero render-blocking penalties.</w:t>
+      </w:r>
+    </w:p>
+    <w:p>
+      <w:pPr>
+        <w:pStyle w:val="Heading2"/>
+        <w:spacing w:before="200" w:after="80"/>
+      </w:pPr>
+      <w:r>
+        <w:rPr>
+          <w:rFonts w:ascii="Calibri" w:hAnsi="Calibri"/>
+          <w:b/>
+          <w:color w:val="2563EB"/>
+          <w:sz w:val="26"/>
+        </w:rPr>
+        <w:t>7.2 Challenge 2: Eliminating Cumulative Layout Shift (CLS) Across Viewports</w:t>
+      </w:r>
+    </w:p>
+    <w:p>
+      <w:pPr>
+        <w:spacing w:after="120" w:line="276" w:lineRule="auto"/>
+      </w:pPr>
+      <w:r>
+        <w:rPr>
+          <w:rFonts w:ascii="Calibri" w:hAnsi="Calibri"/>
+          <w:color w:val="374151"/>
+          <w:sz w:val="22"/>
+        </w:rPr>
+        <w:t>High-DPI responsive images often cause content displacement while downloading on mobile devices. This was eliminated by enforcing dual-layer geometry: declaring intrinsic width and height attributes in HTML alongside modern CSS aspect-ratio rules (800 / 500 for the Hero, and 400 / 300 for product cards). The browser allocates layout space before receiving image bytes, achieving a CLS of 0.000.</w:t>
+      </w:r>
+    </w:p>
+    <w:p>
+      <w:pPr>
+        <w:pStyle w:val="Heading2"/>
+        <w:spacing w:before="200" w:after="80"/>
+      </w:pPr>
+      <w:r>
+        <w:rPr>
+          <w:rFonts w:ascii="Calibri" w:hAnsi="Calibri"/>
+          <w:b/>
+          <w:color w:val="2563EB"/>
+          <w:sz w:val="26"/>
+        </w:rPr>
+        <w:t>7.3 Challenge 3: Real-Time Telemetry Without Main-Thread Contention</w:t>
+      </w:r>
+    </w:p>
+    <w:p>
+      <w:pPr>
+        <w:spacing w:after="120" w:line="276" w:lineRule="auto"/>
+      </w:pPr>
+      <w:r>
+        <w:rPr>
+          <w:rFonts w:ascii="Calibri" w:hAnsi="Calibri"/>
+          <w:color w:val="374151"/>
+          <w:sz w:val="22"/>
+        </w:rPr>
+        <w:t>Capturing real-time Core Web Vitals using polling can ironically degrade the very performance being measured. To avoid main-thread overhead, native asynchronous PerformanceObserver entries were leveraged for buffered paint, LCP, and layout-shift events. All DOM mutations and scroll listeners were synchronized with hardware display refreshes using window.requestAnimationFrame, maintaining a Total Blocking Time (TBT) of 0 ms.</w:t>
+      </w:r>
+    </w:p>
+    <w:p>
+      <w:pPr>
+        <w:pStyle w:val="Heading2"/>
+        <w:spacing w:before="200" w:after="80"/>
+      </w:pPr>
+      <w:r>
+        <w:rPr>
+          <w:rFonts w:ascii="Calibri" w:hAnsi="Calibri"/>
+          <w:b/>
+          <w:color w:val="2563EB"/>
+          <w:sz w:val="26"/>
+        </w:rPr>
+        <w:t>7.4 Challenge 4: High-Fidelity Commercial Photography vs Network Payload</w:t>
+      </w:r>
+    </w:p>
+    <w:p>
+      <w:pPr>
+        <w:spacing w:after="120" w:line="276" w:lineRule="auto"/>
+      </w:pPr>
+      <w:r>
+        <w:rPr>
+          <w:rFonts w:ascii="Calibri" w:hAnsi="Calibri"/>
+          <w:color w:val="374151"/>
+          <w:sz w:val="22"/>
+        </w:rPr>
+        <w:t>Studio-grade product photography can easily inflate transfer sizes beyond acceptable mobile thresholds (&gt; 3 MB). To reconcile commercial realism with instant speed, assets were resampled using high-efficiency bicubic compression (85% quality factor) and configured with native loading='lazy' on secondary cards, reducing the total image payload to ~115 KB while maintaining razor-sharp visual fidelity.</w:t>
+      </w:r>
+    </w:p>
+    <w:p>
+      <w:pPr>
+        <w:pStyle w:val="Heading1"/>
+        <w:spacing w:before="280" w:after="120"/>
+      </w:pPr>
+      <w:r>
+        <w:rPr>
+          <w:rFonts w:ascii="Calibri" w:hAnsi="Calibri"/>
+          <w:b/>
+          <w:color w:val="1E3A8A"/>
+          <w:sz w:val="32"/>
+        </w:rPr>
+        <w:t>8. Audit Results &amp; Final Deliverables</w:t>
       </w:r>
     </w:p>
     <w:p>

</xml_diff>

<commit_message>
docs: sync updated week 4 word report
</commit_message>
<xml_diff>
--- a/report/report_week4.docx
+++ b/report/report_week4.docx
@@ -1,14 +1,13 @@
 
 <file path=word/document.xml><?xml version="1.0" encoding="utf-8"?>
-<w:document xmlns:w="http://schemas.openxmlformats.org/wordprocessingml/2006/main">
+<w:document xmlns:wpc="http://schemas.microsoft.com/office/word/2010/wordprocessingCanvas" xmlns:cx="http://schemas.microsoft.com/office/drawing/2014/chartex" xmlns:cx1="http://schemas.microsoft.com/office/drawing/2015/9/8/chartex" xmlns:cx2="http://schemas.microsoft.com/office/drawing/2015/10/21/chartex" xmlns:cx3="http://schemas.microsoft.com/office/drawing/2016/5/9/chartex" xmlns:cx4="http://schemas.microsoft.com/office/drawing/2016/5/10/chartex" xmlns:cx5="http://schemas.microsoft.com/office/drawing/2016/5/11/chartex" xmlns:cx6="http://schemas.microsoft.com/office/drawing/2016/5/12/chartex" xmlns:cx7="http://schemas.microsoft.com/office/drawing/2016/5/13/chartex" xmlns:cx8="http://schemas.microsoft.com/office/drawing/2016/5/14/chartex" xmlns:mc="http://schemas.openxmlformats.org/markup-compatibility/2006" xmlns:aink="http://schemas.microsoft.com/office/drawing/2016/ink" xmlns:am3d="http://schemas.microsoft.com/office/drawing/2017/model3d" xmlns:o="urn:schemas-microsoft-com:office:office" xmlns:oel="http://schemas.microsoft.com/office/2019/extlst" xmlns:r="http://schemas.openxmlformats.org/officeDocument/2006/relationships" xmlns:m="http://schemas.openxmlformats.org/officeDocument/2006/math" xmlns:v="urn:schemas-microsoft-com:vml" xmlns:wp14="http://schemas.microsoft.com/office/word/2010/wordprocessingDrawing" xmlns:wp="http://schemas.openxmlformats.org/drawingml/2006/wordprocessingDrawing" xmlns:w10="urn:schemas-microsoft-com:office:word" xmlns:w="http://schemas.openxmlformats.org/wordprocessingml/2006/main" xmlns:w14="http://schemas.microsoft.com/office/word/2010/wordml" xmlns:w15="http://schemas.microsoft.com/office/word/2012/wordml" xmlns:w16cex="http://schemas.microsoft.com/office/word/2018/wordml/cex" xmlns:w16cid="http://schemas.microsoft.com/office/word/2016/wordml/cid" xmlns:w16="http://schemas.microsoft.com/office/word/2018/wordml" xmlns:w16du="http://schemas.microsoft.com/office/word/2023/wordml/word16du" xmlns:w16sdtdh="http://schemas.microsoft.com/office/word/2020/wordml/sdtdatahash" xmlns:w16sdtfl="http://schemas.microsoft.com/office/word/2024/wordml/sdtformatlock" xmlns:w16se="http://schemas.microsoft.com/office/word/2015/wordml/symex" xmlns:wpg="http://schemas.microsoft.com/office/word/2010/wordprocessingGroup" xmlns:wpi="http://schemas.microsoft.com/office/word/2010/wordprocessingInk" xmlns:wne="http://schemas.microsoft.com/office/word/2006/wordml" xmlns:wps="http://schemas.microsoft.com/office/word/2010/wordprocessingShape" mc:Ignorable="w14 w15 w16se w16cid w16 w16cex w16sdtdh w16sdtfl w16du wp14">
   <w:body>
     <w:p>
       <w:pPr>
-        <w:spacing w:before="0" w:after="80"/>
-      </w:pPr>
-      <w:r>
-        <w:rPr>
-          <w:rFonts w:ascii="Calibri" w:hAnsi="Calibri"/>
+        <w:spacing w:after="80"/>
+      </w:pPr>
+      <w:r>
+        <w:rPr>
           <w:b/>
           <w:color w:val="1E40AF"/>
           <w:sz w:val="20"/>
@@ -18,11 +17,10 @@
     </w:p>
     <w:p>
       <w:pPr>
-        <w:spacing w:before="0" w:after="60"/>
-      </w:pPr>
-      <w:r>
-        <w:rPr>
-          <w:rFonts w:ascii="Calibri" w:hAnsi="Calibri"/>
+        <w:spacing w:after="60"/>
+      </w:pPr>
+      <w:r>
+        <w:rPr>
           <w:b/>
           <w:color w:val="0F172A"/>
           <w:sz w:val="48"/>
@@ -32,11 +30,10 @@
     </w:p>
     <w:p>
       <w:pPr>
-        <w:spacing w:before="0" w:after="240"/>
-      </w:pPr>
-      <w:r>
-        <w:rPr>
-          <w:rFonts w:ascii="Calibri" w:hAnsi="Calibri"/>
+        <w:spacing w:after="240"/>
+      </w:pPr>
+      <w:r>
+        <w:rPr>
           <w:color w:val="475569"/>
           <w:sz w:val="24"/>
         </w:rPr>
@@ -50,43 +47,67 @@
         </w:pBdr>
         <w:spacing w:after="280"/>
       </w:pPr>
+      <w:proofErr w:type="spellStart"/>
+      <w:proofErr w:type="gramStart"/>
       <w:r>
         <w:rPr>
           <w:b/>
           <w:color w:val="1F2937"/>
           <w:sz w:val="20"/>
         </w:rPr>
-        <w:t>Candidate: </w:t>
+        <w:t>Candidate:</w:t>
       </w:r>
       <w:r>
         <w:rPr>
           <w:color w:val="4B5563"/>
           <w:sz w:val="20"/>
         </w:rPr>
-        <w:t xml:space="preserve">Ashish Ranjan Singh    |    </w:t>
-      </w:r>
+        <w:t>Ashish</w:t>
+      </w:r>
+      <w:proofErr w:type="spellEnd"/>
+      <w:proofErr w:type="gramEnd"/>
+      <w:r>
+        <w:rPr>
+          <w:color w:val="4B5563"/>
+          <w:sz w:val="20"/>
+        </w:rPr>
+        <w:t xml:space="preserve"> Ranjan Singh    |    </w:t>
+      </w:r>
+      <w:proofErr w:type="spellStart"/>
+      <w:proofErr w:type="gramStart"/>
       <w:r>
         <w:rPr>
           <w:b/>
           <w:color w:val="1F2937"/>
           <w:sz w:val="20"/>
         </w:rPr>
-        <w:t>Assignment: </w:t>
+        <w:t>Assignment:</w:t>
       </w:r>
       <w:r>
         <w:rPr>
           <w:color w:val="4B5563"/>
           <w:sz w:val="20"/>
         </w:rPr>
-        <w:t xml:space="preserve">Week 4    |    </w:t>
-      </w:r>
+        <w:t>Week</w:t>
+      </w:r>
+      <w:proofErr w:type="spellEnd"/>
+      <w:proofErr w:type="gramEnd"/>
+      <w:r>
+        <w:rPr>
+          <w:color w:val="4B5563"/>
+          <w:sz w:val="20"/>
+        </w:rPr>
+        <w:t xml:space="preserve"> 4    |    </w:t>
+      </w:r>
+      <w:proofErr w:type="spellStart"/>
+      <w:proofErr w:type="gramStart"/>
       <w:r>
         <w:rPr>
           <w:b/>
           <w:color w:val="1F2937"/>
           <w:sz w:val="20"/>
         </w:rPr>
-        <w:t>Status: </w:t>
+        <w:t>Status:</w:t>
       </w:r>
       <w:r>
         <w:rPr>
@@ -94,17 +115,25 @@
           <w:color w:val="059669"/>
           <w:sz w:val="20"/>
         </w:rPr>
-        <w:t>Completed &amp; Verified</w:t>
-      </w:r>
-    </w:p>
-    <w:p>
-      <w:pPr>
-        <w:pStyle w:val="Heading1"/>
+        <w:t>Completed</w:t>
+      </w:r>
+      <w:proofErr w:type="spellEnd"/>
+      <w:proofErr w:type="gramEnd"/>
+      <w:r>
+        <w:rPr>
+          <w:b/>
+          <w:color w:val="059669"/>
+          <w:sz w:val="20"/>
+        </w:rPr>
+        <w:t xml:space="preserve"> &amp; Verified</w:t>
+      </w:r>
+    </w:p>
+    <w:p>
+      <w:pPr>
         <w:spacing w:before="280" w:after="120"/>
       </w:pPr>
       <w:r>
         <w:rPr>
-          <w:rFonts w:ascii="Calibri" w:hAnsi="Calibri"/>
           <w:b/>
           <w:color w:val="1E3A8A"/>
           <w:sz w:val="32"/>
@@ -118,9 +147,7 @@
       </w:pPr>
       <w:r>
         <w:rPr>
-          <w:rFonts w:ascii="Calibri" w:hAnsi="Calibri"/>
-          <w:color w:val="374151"/>
-          <w:sz w:val="22"/>
+          <w:color w:val="374151"/>
         </w:rPr>
         <w:t>This technical engineering report documents the architectural design, implementation, and empirical verification of the Week 4 deliverable for the Junior Frontend Developer Internship at Yuva Intern (https://yuvaintern.com/my-internships). The objective of the Frontend Performance Optimization Challenge was to identify, diagnose, and systematically eliminate all critical frontend loading bottlenecks—including render-blocking stylesheets, unprioritized asset waterfalls, main-thread blocking tasks, and Cumulative Layout Shifts (CLS)—transforming a bloated media showcase into an ultra-high-velocity production application that achieves a flawless 100/100 Google Lighthouse score and industry-leading Core Web Vitals.</w:t>
       </w:r>
@@ -128,6 +155,7 @@
     <w:tbl>
       <w:tblPr>
         <w:tblW w:w="9200" w:type="dxa"/>
+        <w:tblInd w:w="180" w:type="dxa"/>
         <w:tblBorders>
           <w:top w:val="single" w:sz="6" w:space="0" w:color="3B82F6"/>
           <w:left w:val="single" w:sz="24" w:space="0" w:color="2563EB"/>
@@ -140,7 +168,11 @@
           <w:bottom w:w="120" w:type="dxa"/>
           <w:right w:w="180" w:type="dxa"/>
         </w:tblCellMar>
+        <w:tblLook w:val="04A0" w:firstRow="1" w:lastRow="0" w:firstColumn="1" w:lastColumn="0" w:noHBand="0" w:noVBand="1"/>
       </w:tblPr>
+      <w:tblGrid>
+        <w:gridCol w:w="9200"/>
+      </w:tblGrid>
       <w:tr>
         <w:tc>
           <w:tcPr>
@@ -169,11 +201,49 @@
                 <w:color w:val="1E3A8A"/>
                 <w:sz w:val="20"/>
               </w:rPr>
-              <w:t>Student Name: Ashish Ranjan Singh
-Internship Period: 5 Weeks (07-Jul-2026 to 11-Aug-2026)
-GitHub Repository: https://github.com/ASHISH-7142023/Yuva-Week4-Performance-Challenge
-Deliverable: Week 4 of 5 (Frontend Performance Optimization Challenge)
-Target Standard: Google Lighthouse 100/100 | Core Web Vitals AA Benchmark</w:t>
+              <w:t xml:space="preserve">Student Name: Ashish Ranjan Singh Internship Period: 5 Weeks (07-Jul-2026 to 11-Aug-2026) </w:t>
+            </w:r>
+            <w:r>
+              <w:rPr>
+                <w:color w:val="1E3A8A"/>
+                <w:sz w:val="20"/>
+              </w:rPr>
+              <w:br/>
+            </w:r>
+            <w:r>
+              <w:rPr>
+                <w:color w:val="1E3A8A"/>
+                <w:sz w:val="20"/>
+              </w:rPr>
+              <w:t xml:space="preserve">GitHub Repository: https://github.com/ASHISH-7142023/Yuva-Week4-Performance-Challenge </w:t>
+            </w:r>
+            <w:r>
+              <w:rPr>
+                <w:color w:val="1E3A8A"/>
+                <w:sz w:val="20"/>
+              </w:rPr>
+              <w:br/>
+            </w:r>
+            <w:r>
+              <w:rPr>
+                <w:color w:val="1E3A8A"/>
+                <w:sz w:val="20"/>
+              </w:rPr>
+              <w:t xml:space="preserve">Deliverable: Week 4 of 5 (Frontend Performance Optimization Challenge) </w:t>
+            </w:r>
+            <w:r>
+              <w:rPr>
+                <w:color w:val="1E3A8A"/>
+                <w:sz w:val="20"/>
+              </w:rPr>
+              <w:br/>
+            </w:r>
+            <w:r>
+              <w:rPr>
+                <w:color w:val="1E3A8A"/>
+                <w:sz w:val="20"/>
+              </w:rPr>
+              <w:t>Target Standard: Google Lighthouse 100/100 | Core Web Vitals AA Benchmark</w:t>
             </w:r>
           </w:p>
         </w:tc>
@@ -186,12 +256,10 @@
     </w:p>
     <w:p>
       <w:pPr>
-        <w:pStyle w:val="Heading1"/>
         <w:spacing w:before="280" w:after="120"/>
       </w:pPr>
       <w:r>
         <w:rPr>
-          <w:rFonts w:ascii="Calibri" w:hAnsi="Calibri"/>
           <w:b/>
           <w:color w:val="1E3A8A"/>
           <w:sz w:val="32"/>
@@ -205,21 +273,31 @@
       </w:pPr>
       <w:r>
         <w:rPr>
-          <w:rFonts w:ascii="Calibri" w:hAnsi="Calibri"/>
-          <w:color w:val="374151"/>
-          <w:sz w:val="22"/>
-        </w:rPr>
-        <w:t>The Critical Rendering Path (CRP) represents the exact sequence of steps the browser takes from receiving initial HTML bytes to executing pixel rasterization onto the screen. In typical unoptimized applications, external &lt;link rel='stylesheet'&gt; tags and synchronous &lt;script&gt; tags block the DOM and CSSOM construction, forcing the browser into an idle waiting state while roundtrips resolve.</w:t>
-      </w:r>
-    </w:p>
-    <w:p>
-      <w:pPr>
-        <w:pStyle w:val="Heading2"/>
+          <w:color w:val="374151"/>
+        </w:rPr>
+        <w:t xml:space="preserve">The Critical Rendering Path (CRP) represents the exact sequence of steps the browser takes from receiving initial HTML bytes to executing pixel rasterization onto the screen. In typical unoptimized applications, external &lt;link </w:t>
+      </w:r>
+      <w:proofErr w:type="spellStart"/>
+      <w:r>
+        <w:rPr>
+          <w:color w:val="374151"/>
+        </w:rPr>
+        <w:t>rel</w:t>
+      </w:r>
+      <w:proofErr w:type="spellEnd"/>
+      <w:r>
+        <w:rPr>
+          <w:color w:val="374151"/>
+        </w:rPr>
+        <w:t>='stylesheet'&gt; tags and synchronous &lt;script&gt; tags block the DOM and CSSOM construction, forcing the browser into an idle waiting state while roundtrips resolve.</w:t>
+      </w:r>
+    </w:p>
+    <w:p>
+      <w:pPr>
         <w:spacing w:before="200" w:after="80"/>
       </w:pPr>
       <w:r>
         <w:rPr>
-          <w:rFonts w:ascii="Calibri" w:hAnsi="Calibri"/>
           <w:b/>
           <w:color w:val="2563EB"/>
           <w:sz w:val="26"/>
@@ -233,25 +311,36 @@
       </w:pPr>
       <w:r>
         <w:rPr>
-          <w:rFonts w:ascii="Calibri" w:hAnsi="Calibri"/>
-          <w:color w:val="374151"/>
-          <w:sz w:val="22"/>
-        </w:rPr>
-        <w:t>To achieve a sub-400ms First Contentful Paint (FCP), all CSS rules necessary to render above-the-fold layout primitives—including CSS variables, reset rules, header positioning, hero grid layout, and the primary LCP media skeleton—were extracted and directly embedded inside a lightweight (&lt; 8KB) &lt;style&gt; block in the document &lt;head&gt;. This guarantees that upon receiving the initial TCP packet, the browser can immediately compute the Render Tree without waiting for secondary network requests.</w:t>
-      </w:r>
-    </w:p>
-    <w:p>
-      <w:pPr>
-        <w:pStyle w:val="Heading2"/>
+          <w:color w:val="374151"/>
+        </w:rPr>
+        <w:t xml:space="preserve">To achieve a sub-400ms First </w:t>
+      </w:r>
+      <w:proofErr w:type="spellStart"/>
+      <w:r>
+        <w:rPr>
+          <w:color w:val="374151"/>
+        </w:rPr>
+        <w:t>Contentful</w:t>
+      </w:r>
+      <w:proofErr w:type="spellEnd"/>
+      <w:r>
+        <w:rPr>
+          <w:color w:val="374151"/>
+        </w:rPr>
+        <w:t xml:space="preserve"> Paint (FCP), all CSS rules necessary to render above-the-fold layout primitives—including CSS variables, reset rules, header positioning, hero grid layout, and the primary LCP media skeleton—were extracted and directly embedded inside a lightweight (&lt; 8KB) &lt;style&gt; block in the document &lt;head&gt;. This guarantees that upon receiving the initial TCP packet, the browser can immediately compute the Render Tree without waiting for secondary network requests.</w:t>
+      </w:r>
+    </w:p>
+    <w:p>
+      <w:pPr>
         <w:spacing w:before="200" w:after="80"/>
       </w:pPr>
       <w:r>
         <w:rPr>
-          <w:rFonts w:ascii="Calibri" w:hAnsi="Calibri"/>
           <w:b/>
           <w:color w:val="2563EB"/>
           <w:sz w:val="26"/>
         </w:rPr>
+        <w:lastRenderedPageBreak/>
         <w:t>2.2 Asynchronous Non-Critical Stylesheet Delivery</w:t>
       </w:r>
     </w:p>
@@ -261,21 +350,91 @@
       </w:pPr>
       <w:r>
         <w:rPr>
-          <w:rFonts w:ascii="Calibri" w:hAnsi="Calibri"/>
-          <w:color w:val="374151"/>
-          <w:sz w:val="22"/>
-        </w:rPr>
-        <w:t>Stylesheets governing below-the-fold components (product showcase cards, quick inspect modal dialogs, benchmark comparison tables, and site footer) are loaded asynchronously using the non-blocking preload pattern: &lt;link rel='preload' href='styles.css' as='style' onload='this.onload=null;this.rel="stylesheet"'&gt;. A progressive &lt;noscript&gt; fallback is preserved to guarantee complete styling for user agents with disabled JavaScript.</w:t>
-      </w:r>
-    </w:p>
-    <w:p>
-      <w:pPr>
-        <w:pStyle w:val="Heading1"/>
+          <w:color w:val="374151"/>
+        </w:rPr>
+        <w:t xml:space="preserve">Stylesheets governing below-the-fold components (product showcase cards, quick inspect modal dialogs, benchmark comparison tables, and site footer) are loaded asynchronously using the non-blocking preload pattern: &lt;link </w:t>
+      </w:r>
+      <w:proofErr w:type="spellStart"/>
+      <w:r>
+        <w:rPr>
+          <w:color w:val="374151"/>
+        </w:rPr>
+        <w:t>rel</w:t>
+      </w:r>
+      <w:proofErr w:type="spellEnd"/>
+      <w:r>
+        <w:rPr>
+          <w:color w:val="374151"/>
+        </w:rPr>
+        <w:t xml:space="preserve">='preload' </w:t>
+      </w:r>
+      <w:proofErr w:type="spellStart"/>
+      <w:r>
+        <w:rPr>
+          <w:color w:val="374151"/>
+        </w:rPr>
+        <w:t>href</w:t>
+      </w:r>
+      <w:proofErr w:type="spellEnd"/>
+      <w:r>
+        <w:rPr>
+          <w:color w:val="374151"/>
+        </w:rPr>
+        <w:t>='styles.css' as='style' onload='</w:t>
+      </w:r>
+      <w:proofErr w:type="spellStart"/>
+      <w:proofErr w:type="gramStart"/>
+      <w:r>
+        <w:rPr>
+          <w:color w:val="374151"/>
+        </w:rPr>
+        <w:t>this.onload</w:t>
+      </w:r>
+      <w:proofErr w:type="spellEnd"/>
+      <w:proofErr w:type="gramEnd"/>
+      <w:r>
+        <w:rPr>
+          <w:color w:val="374151"/>
+        </w:rPr>
+        <w:t>=</w:t>
+      </w:r>
+      <w:proofErr w:type="spellStart"/>
+      <w:proofErr w:type="gramStart"/>
+      <w:r>
+        <w:rPr>
+          <w:color w:val="374151"/>
+        </w:rPr>
+        <w:t>null;this.rel</w:t>
+      </w:r>
+      <w:proofErr w:type="spellEnd"/>
+      <w:proofErr w:type="gramEnd"/>
+      <w:r>
+        <w:rPr>
+          <w:color w:val="374151"/>
+        </w:rPr>
+        <w:t>="stylesheet"'&gt;. A progressive &lt;</w:t>
+      </w:r>
+      <w:proofErr w:type="spellStart"/>
+      <w:r>
+        <w:rPr>
+          <w:color w:val="374151"/>
+        </w:rPr>
+        <w:t>noscript</w:t>
+      </w:r>
+      <w:proofErr w:type="spellEnd"/>
+      <w:r>
+        <w:rPr>
+          <w:color w:val="374151"/>
+        </w:rPr>
+        <w:t>&gt; fallback is preserved to guarantee complete styling for user agents with disabled JavaScript.</w:t>
+      </w:r>
+    </w:p>
+    <w:p>
+      <w:pPr>
         <w:spacing w:before="280" w:after="120"/>
       </w:pPr>
       <w:r>
         <w:rPr>
-          <w:rFonts w:ascii="Calibri" w:hAnsi="Calibri"/>
           <w:b/>
           <w:color w:val="1E3A8A"/>
           <w:sz w:val="32"/>
@@ -289,81 +448,185 @@
       </w:pPr>
       <w:r>
         <w:rPr>
-          <w:rFonts w:ascii="Calibri" w:hAnsi="Calibri"/>
-          <w:color w:val="374151"/>
-          <w:sz w:val="22"/>
+          <w:color w:val="374151"/>
         </w:rPr>
         <w:t>Media assets often represent over 70% of total page transfer weight and are the most frequent cause of jarring layout shifts (CLS). The Aura Engine implements a comprehensive media delivery strategy:</w:t>
       </w:r>
     </w:p>
     <w:p>
       <w:pPr>
-        <w:pStyle w:val="Heading2"/>
         <w:spacing w:before="200" w:after="80"/>
       </w:pPr>
       <w:r>
         <w:rPr>
-          <w:rFonts w:ascii="Calibri" w:hAnsi="Calibri"/>
           <w:b/>
           <w:color w:val="2563EB"/>
           <w:sz w:val="26"/>
         </w:rPr>
-        <w:t>3.1 LCP Preloading with fetchpriority='high'</w:t>
-      </w:r>
-    </w:p>
-    <w:p>
-      <w:pPr>
-        <w:spacing w:after="120" w:line="276" w:lineRule="auto"/>
-      </w:pPr>
-      <w:r>
-        <w:rPr>
-          <w:rFonts w:ascii="Calibri" w:hAnsi="Calibri"/>
-          <w:color w:val="374151"/>
-          <w:sz w:val="22"/>
-        </w:rPr>
-        <w:t>The primary hero vector visual is identified as the Largest Contentful Paint (LCP) element on the viewport. To prevent network discovery delays, a preload directive is placed directly in &lt;head&gt;: &lt;link rel='preload' as='image' href='assets/hero-aura-pro.svg' fetchpriority='high'&gt;. Concurrently, the &lt;img&gt; element is flagged with fetchpriority='high' and decoding='async', reducing LCP time from 3.80s down to 0.58s (+84.7% speed improvement).</w:t>
-      </w:r>
-    </w:p>
-    <w:p>
-      <w:pPr>
-        <w:pStyle w:val="Heading2"/>
-        <w:spacing w:before="200" w:after="80"/>
-      </w:pPr>
-      <w:r>
-        <w:rPr>
-          <w:rFonts w:ascii="Calibri" w:hAnsi="Calibri"/>
+        <w:t xml:space="preserve">3.1 LCP Preloading with </w:t>
+      </w:r>
+      <w:proofErr w:type="spellStart"/>
+      <w:r>
+        <w:rPr>
           <w:b/>
           <w:color w:val="2563EB"/>
           <w:sz w:val="26"/>
         </w:rPr>
-        <w:t>3.2 Strict Layout Reservation &amp; Zero CLS (0.000)</w:t>
-      </w:r>
-    </w:p>
-    <w:p>
-      <w:pPr>
-        <w:spacing w:after="120" w:line="276" w:lineRule="auto"/>
-      </w:pPr>
-      <w:r>
-        <w:rPr>
-          <w:rFonts w:ascii="Calibri" w:hAnsi="Calibri"/>
-          <w:color w:val="374151"/>
-          <w:sz w:val="22"/>
-        </w:rPr>
-        <w:t>Cumulative Layout Shift occurs when an image or container without declared dimensions finishes loading and pushes surrounding DOM nodes downwards. In Aura, every media element specifies explicit intrinsic width and height attributes in HTML. Furthermore, all parent media boxes enforce strict CSS aspect-ratio constraints (800 / 500 for the hero showcase, and 400 / 300 for product cards). The layout engine pre-allocates exact coordinate boxes during initial layout calculation, resulting in a perfect measured CLS of 0.000.</w:t>
-      </w:r>
-    </w:p>
-    <w:p>
-      <w:pPr>
-        <w:pStyle w:val="Heading2"/>
-        <w:spacing w:before="200" w:after="80"/>
-      </w:pPr>
-      <w:r>
-        <w:rPr>
-          <w:rFonts w:ascii="Calibri" w:hAnsi="Calibri"/>
+        <w:t>fetchpriority</w:t>
+      </w:r>
+      <w:proofErr w:type="spellEnd"/>
+      <w:r>
+        <w:rPr>
           <w:b/>
           <w:color w:val="2563EB"/>
           <w:sz w:val="26"/>
         </w:rPr>
+        <w:t>='high'</w:t>
+      </w:r>
+    </w:p>
+    <w:p>
+      <w:pPr>
+        <w:spacing w:after="120" w:line="276" w:lineRule="auto"/>
+      </w:pPr>
+      <w:r>
+        <w:rPr>
+          <w:color w:val="374151"/>
+        </w:rPr>
+        <w:t xml:space="preserve">The primary hero vector visual is identified as the Largest </w:t>
+      </w:r>
+      <w:proofErr w:type="spellStart"/>
+      <w:r>
+        <w:rPr>
+          <w:color w:val="374151"/>
+        </w:rPr>
+        <w:t>Contentful</w:t>
+      </w:r>
+      <w:proofErr w:type="spellEnd"/>
+      <w:r>
+        <w:rPr>
+          <w:color w:val="374151"/>
+        </w:rPr>
+        <w:t xml:space="preserve"> Paint (LCP) element on the viewport. To prevent network discovery delays, a preload directive is placed directly in &lt;head&gt;: &lt;link </w:t>
+      </w:r>
+      <w:proofErr w:type="spellStart"/>
+      <w:r>
+        <w:rPr>
+          <w:color w:val="374151"/>
+        </w:rPr>
+        <w:t>rel</w:t>
+      </w:r>
+      <w:proofErr w:type="spellEnd"/>
+      <w:r>
+        <w:rPr>
+          <w:color w:val="374151"/>
+        </w:rPr>
+        <w:t xml:space="preserve">='preload' as='image' </w:t>
+      </w:r>
+      <w:proofErr w:type="spellStart"/>
+      <w:r>
+        <w:rPr>
+          <w:color w:val="374151"/>
+        </w:rPr>
+        <w:t>href</w:t>
+      </w:r>
+      <w:proofErr w:type="spellEnd"/>
+      <w:r>
+        <w:rPr>
+          <w:color w:val="374151"/>
+        </w:rPr>
+        <w:t>='assets/hero-aura-</w:t>
+      </w:r>
+      <w:proofErr w:type="spellStart"/>
+      <w:r>
+        <w:rPr>
+          <w:color w:val="374151"/>
+        </w:rPr>
+        <w:t>pro.svg</w:t>
+      </w:r>
+      <w:proofErr w:type="spellEnd"/>
+      <w:r>
+        <w:rPr>
+          <w:color w:val="374151"/>
+        </w:rPr>
+        <w:t xml:space="preserve">' </w:t>
+      </w:r>
+      <w:proofErr w:type="spellStart"/>
+      <w:r>
+        <w:rPr>
+          <w:color w:val="374151"/>
+        </w:rPr>
+        <w:t>fetchpriority</w:t>
+      </w:r>
+      <w:proofErr w:type="spellEnd"/>
+      <w:r>
+        <w:rPr>
+          <w:color w:val="374151"/>
+        </w:rPr>
+        <w:t>='high'&gt;. Concurrently, the &lt;</w:t>
+      </w:r>
+      <w:proofErr w:type="spellStart"/>
+      <w:r>
+        <w:rPr>
+          <w:color w:val="374151"/>
+        </w:rPr>
+        <w:t>img</w:t>
+      </w:r>
+      <w:proofErr w:type="spellEnd"/>
+      <w:r>
+        <w:rPr>
+          <w:color w:val="374151"/>
+        </w:rPr>
+        <w:t xml:space="preserve">&gt; element is flagged with </w:t>
+      </w:r>
+      <w:proofErr w:type="spellStart"/>
+      <w:r>
+        <w:rPr>
+          <w:color w:val="374151"/>
+        </w:rPr>
+        <w:t>fetchpriority</w:t>
+      </w:r>
+      <w:proofErr w:type="spellEnd"/>
+      <w:r>
+        <w:rPr>
+          <w:color w:val="374151"/>
+        </w:rPr>
+        <w:t>='high' and decoding='async', reducing LCP time from 3.80s down to 0.58s (+84.7% speed improvement).</w:t>
+      </w:r>
+    </w:p>
+    <w:p>
+      <w:pPr>
+        <w:spacing w:before="200" w:after="80"/>
+      </w:pPr>
+      <w:r>
+        <w:rPr>
+          <w:b/>
+          <w:color w:val="2563EB"/>
+          <w:sz w:val="26"/>
+        </w:rPr>
+        <w:t>3.2 Strict Layout Reservation &amp; Zero CLS (0.000)</w:t>
+      </w:r>
+    </w:p>
+    <w:p>
+      <w:pPr>
+        <w:spacing w:after="120" w:line="276" w:lineRule="auto"/>
+      </w:pPr>
+      <w:r>
+        <w:rPr>
+          <w:color w:val="374151"/>
+        </w:rPr>
+        <w:t>Cumulative Layout Shift occurs when an image or container without declared dimensions finishes loading and pushes surrounding DOM nodes downwards. In Aura, every media element specifies explicit intrinsic width and height attributes in HTML. Furthermore, all parent media boxes enforce strict CSS aspect-ratio constraints (800 / 500 for the hero showcase, and 400 / 300 for product cards). The layout engine pre-allocates exact coordinate boxes during initial layout calculation, resulting in a perfect measured CLS of 0.000.</w:t>
+      </w:r>
+    </w:p>
+    <w:p>
+      <w:pPr>
+        <w:spacing w:before="200" w:after="80"/>
+      </w:pPr>
+      <w:r>
+        <w:rPr>
+          <w:b/>
+          <w:color w:val="2563EB"/>
+          <w:sz w:val="26"/>
+        </w:rPr>
         <w:t>3.3 Native Lazy Loading for Below-the-Fold Assets</w:t>
       </w:r>
     </w:p>
@@ -373,25 +636,62 @@
       </w:pPr>
       <w:r>
         <w:rPr>
-          <w:rFonts w:ascii="Calibri" w:hAnsi="Calibri"/>
-          <w:color w:val="374151"/>
-          <w:sz w:val="22"/>
+          <w:color w:val="374151"/>
         </w:rPr>
         <w:t>All four secondary product showcase graphics utilize native browser lazy-loading (loading='lazy'). Network requests for these assets are held in abeyance until the user scrolls within proximity of the product grid, dramatically conserving mobile data and network contention.</w:t>
       </w:r>
     </w:p>
     <w:p>
       <w:pPr>
-        <w:pStyle w:val="Heading1"/>
         <w:spacing w:before="280" w:after="120"/>
-      </w:pPr>
-      <w:r>
-        <w:rPr>
-          <w:rFonts w:ascii="Calibri" w:hAnsi="Calibri"/>
+        <w:rPr>
           <w:b/>
           <w:color w:val="1E3A8A"/>
           <w:sz w:val="32"/>
         </w:rPr>
+      </w:pPr>
+    </w:p>
+    <w:p>
+      <w:pPr>
+        <w:spacing w:before="280" w:after="120"/>
+        <w:rPr>
+          <w:b/>
+          <w:color w:val="1E3A8A"/>
+          <w:sz w:val="32"/>
+        </w:rPr>
+      </w:pPr>
+    </w:p>
+    <w:p>
+      <w:pPr>
+        <w:spacing w:before="280" w:after="120"/>
+        <w:rPr>
+          <w:b/>
+          <w:color w:val="1E3A8A"/>
+          <w:sz w:val="32"/>
+        </w:rPr>
+      </w:pPr>
+    </w:p>
+    <w:p>
+      <w:pPr>
+        <w:spacing w:before="280" w:after="120"/>
+        <w:rPr>
+          <w:b/>
+          <w:color w:val="1E3A8A"/>
+          <w:sz w:val="32"/>
+        </w:rPr>
+      </w:pPr>
+    </w:p>
+    <w:p>
+      <w:pPr>
+        <w:spacing w:before="280" w:after="120"/>
+      </w:pPr>
+      <w:r>
+        <w:rPr>
+          <w:b/>
+          <w:color w:val="1E3A8A"/>
+          <w:sz w:val="32"/>
+        </w:rPr>
+        <w:lastRenderedPageBreak/>
         <w:t>4. Non-Blocking JavaScript &amp; Event Throttling</w:t>
       </w:r>
     </w:p>
@@ -401,23 +701,20 @@
       </w:pPr>
       <w:r>
         <w:rPr>
-          <w:rFonts w:ascii="Calibri" w:hAnsi="Calibri"/>
-          <w:color w:val="374151"/>
-          <w:sz w:val="22"/>
+          <w:color w:val="374151"/>
         </w:rPr>
         <w:t>Main-thread blocking scripts directly increase Total Blocking Time (TBT) and impair Interaction to Next Paint (INP). The JavaScript layer was engineered with strict performance governance:</w:t>
       </w:r>
     </w:p>
     <w:p>
       <w:pPr>
-        <w:pStyle w:val="ListParagraph"/>
         <w:spacing w:after="80"/>
         <w:ind w:left="360"/>
       </w:pPr>
       <w:r>
         <w:rPr>
+          <w:b/>
           <w:color w:val="2563EB"/>
-          <w:b/>
         </w:rPr>
         <w:t xml:space="preserve">•  </w:t>
       </w:r>
@@ -425,29 +722,25 @@
         <w:rPr>
           <w:b/>
           <w:color w:val="1F2937"/>
-          <w:sz w:val="22"/>
         </w:rPr>
         <w:t xml:space="preserve">Non-blocking Parser: </w:t>
       </w:r>
       <w:r>
         <w:rPr>
-          <w:rFonts w:ascii="Calibri" w:hAnsi="Calibri"/>
           <w:color w:val="4B5563"/>
-          <w:sz w:val="22"/>
         </w:rPr>
         <w:t>Script Execution Deferral: app.js is loaded with the 'defer' attribute, ensuring HTML parsing is never paused.</w:t>
       </w:r>
     </w:p>
     <w:p>
       <w:pPr>
-        <w:pStyle w:val="ListParagraph"/>
         <w:spacing w:after="80"/>
         <w:ind w:left="360"/>
       </w:pPr>
       <w:r>
         <w:rPr>
+          <w:b/>
           <w:color w:val="2563EB"/>
-          <w:b/>
         </w:rPr>
         <w:t xml:space="preserve">•  </w:t>
       </w:r>
@@ -455,29 +748,39 @@
         <w:rPr>
           <w:b/>
           <w:color w:val="1F2937"/>
-          <w:sz w:val="22"/>
         </w:rPr>
         <w:t xml:space="preserve">Smooth 60FPS UI: </w:t>
       </w:r>
       <w:r>
         <w:rPr>
-          <w:rFonts w:ascii="Calibri" w:hAnsi="Calibri"/>
           <w:color w:val="4B5563"/>
-          <w:sz w:val="22"/>
-        </w:rPr>
-        <w:t>RAF Scroll Throttling: Scroll handlers utilize requestAnimationFrame to synchronize with browser display refresh cycles (60Hz/120Hz).</w:t>
-      </w:r>
-    </w:p>
-    <w:p>
-      <w:pPr>
-        <w:pStyle w:val="ListParagraph"/>
+        </w:rPr>
+        <w:t xml:space="preserve">RAF Scroll Throttling: Scroll handlers utilize </w:t>
+      </w:r>
+      <w:proofErr w:type="spellStart"/>
+      <w:r>
+        <w:rPr>
+          <w:color w:val="4B5563"/>
+        </w:rPr>
+        <w:t>requestAnimationFrame</w:t>
+      </w:r>
+      <w:proofErr w:type="spellEnd"/>
+      <w:r>
+        <w:rPr>
+          <w:color w:val="4B5563"/>
+        </w:rPr>
+        <w:t xml:space="preserve"> to synchronize with browser display refresh cycles (60Hz/120Hz).</w:t>
+      </w:r>
+    </w:p>
+    <w:p>
+      <w:pPr>
         <w:spacing w:after="80"/>
         <w:ind w:left="360"/>
       </w:pPr>
       <w:r>
         <w:rPr>
+          <w:b/>
           <w:color w:val="2563EB"/>
-          <w:b/>
         </w:rPr>
         <w:t xml:space="preserve">•  </w:t>
       </w:r>
@@ -485,29 +788,25 @@
         <w:rPr>
           <w:b/>
           <w:color w:val="1F2937"/>
-          <w:sz w:val="22"/>
         </w:rPr>
         <w:t xml:space="preserve">Debounced Dispatch: </w:t>
       </w:r>
       <w:r>
         <w:rPr>
-          <w:rFonts w:ascii="Calibri" w:hAnsi="Calibri"/>
           <w:color w:val="4B5563"/>
-          <w:sz w:val="22"/>
         </w:rPr>
         <w:t>Debounced DOM Updates: Product category filtering uses debounced event handling to prevent rapid DOM thrashing.</w:t>
       </w:r>
     </w:p>
     <w:p>
       <w:pPr>
-        <w:pStyle w:val="ListParagraph"/>
         <w:spacing w:after="80"/>
         <w:ind w:left="360"/>
       </w:pPr>
       <w:r>
         <w:rPr>
+          <w:b/>
           <w:color w:val="2563EB"/>
-          <w:b/>
         </w:rPr>
         <w:t xml:space="preserve">•  </w:t>
       </w:r>
@@ -515,27 +814,44 @@
         <w:rPr>
           <w:b/>
           <w:color w:val="1F2937"/>
-          <w:sz w:val="22"/>
         </w:rPr>
         <w:t xml:space="preserve">Live Telemetry: </w:t>
       </w:r>
-      <w:r>
-        <w:rPr>
-          <w:rFonts w:ascii="Calibri" w:hAnsi="Calibri"/>
+      <w:proofErr w:type="spellStart"/>
+      <w:r>
+        <w:rPr>
           <w:color w:val="4B5563"/>
-          <w:sz w:val="22"/>
-        </w:rPr>
-        <w:t>PerformanceObserver Integration: The native browser PerformanceObserver API tracks real-time FCP, LCP, CLS, and Long Tasks.</w:t>
-      </w:r>
-    </w:p>
-    <w:p>
-      <w:pPr>
-        <w:pStyle w:val="Heading1"/>
+        </w:rPr>
+        <w:t>PerformanceObserver</w:t>
+      </w:r>
+      <w:proofErr w:type="spellEnd"/>
+      <w:r>
+        <w:rPr>
+          <w:color w:val="4B5563"/>
+        </w:rPr>
+        <w:t xml:space="preserve"> Integration: The native browser </w:t>
+      </w:r>
+      <w:proofErr w:type="spellStart"/>
+      <w:r>
+        <w:rPr>
+          <w:color w:val="4B5563"/>
+        </w:rPr>
+        <w:t>PerformanceObserver</w:t>
+      </w:r>
+      <w:proofErr w:type="spellEnd"/>
+      <w:r>
+        <w:rPr>
+          <w:color w:val="4B5563"/>
+        </w:rPr>
+        <w:t xml:space="preserve"> API tracks real-time FCP, LCP, CLS, and Long Tasks.</w:t>
+      </w:r>
+    </w:p>
+    <w:p>
+      <w:pPr>
         <w:spacing w:before="280" w:after="120"/>
       </w:pPr>
       <w:r>
         <w:rPr>
-          <w:rFonts w:ascii="Calibri" w:hAnsi="Calibri"/>
           <w:b/>
           <w:color w:val="1E3A8A"/>
           <w:sz w:val="32"/>
@@ -549,9 +865,7 @@
       </w:pPr>
       <w:r>
         <w:rPr>
-          <w:rFonts w:ascii="Calibri" w:hAnsi="Calibri"/>
-          <w:color w:val="374151"/>
-          <w:sz w:val="22"/>
+          <w:color w:val="374151"/>
         </w:rPr>
         <w:t>The following empirical benchmark matrix contrasts the unoptimized baseline fixture against the optimized Aura Engine under identical simulated 4G mobile throttling environments (1.6 Mbps download, 750 Kbps upload, 150ms roundtrip latency):</w:t>
       </w:r>
@@ -559,6 +873,7 @@
     <w:tbl>
       <w:tblPr>
         <w:tblW w:w="9200" w:type="dxa"/>
+        <w:tblInd w:w="120" w:type="dxa"/>
         <w:tblBorders>
           <w:top w:val="single" w:sz="4" w:space="0" w:color="D1D5DB"/>
           <w:left w:val="single" w:sz="4" w:space="0" w:color="D1D5DB"/>
@@ -573,10 +888,19 @@
           <w:bottom w:w="80" w:type="dxa"/>
           <w:right w:w="120" w:type="dxa"/>
         </w:tblCellMar>
+        <w:tblLook w:val="04A0" w:firstRow="1" w:lastRow="0" w:firstColumn="1" w:lastColumn="0" w:noHBand="0" w:noVBand="1"/>
       </w:tblPr>
+      <w:tblGrid>
+        <w:gridCol w:w="2282"/>
+        <w:gridCol w:w="1706"/>
+        <w:gridCol w:w="1656"/>
+        <w:gridCol w:w="1562"/>
+        <w:gridCol w:w="1994"/>
+      </w:tblGrid>
       <w:tr>
         <w:tc>
           <w:tcPr>
+            <w:tcW w:w="0" w:type="auto"/>
             <w:shd w:val="clear" w:color="auto" w:fill="1E3A8A"/>
           </w:tcPr>
           <w:p>
@@ -595,6 +919,7 @@
         </w:tc>
         <w:tc>
           <w:tcPr>
+            <w:tcW w:w="0" w:type="auto"/>
             <w:shd w:val="clear" w:color="auto" w:fill="1E3A8A"/>
           </w:tcPr>
           <w:p>
@@ -613,6 +938,7 @@
         </w:tc>
         <w:tc>
           <w:tcPr>
+            <w:tcW w:w="0" w:type="auto"/>
             <w:shd w:val="clear" w:color="auto" w:fill="1E3A8A"/>
           </w:tcPr>
           <w:p>
@@ -631,6 +957,7 @@
         </w:tc>
         <w:tc>
           <w:tcPr>
+            <w:tcW w:w="0" w:type="auto"/>
             <w:shd w:val="clear" w:color="auto" w:fill="1E3A8A"/>
           </w:tcPr>
           <w:p>
@@ -649,6 +976,7 @@
         </w:tc>
         <w:tc>
           <w:tcPr>
+            <w:tcW w:w="0" w:type="auto"/>
             <w:shd w:val="clear" w:color="auto" w:fill="1E3A8A"/>
           </w:tcPr>
           <w:p>
@@ -669,6 +997,7 @@
       <w:tr>
         <w:tc>
           <w:tcPr>
+            <w:tcW w:w="0" w:type="auto"/>
             <w:shd w:val="clear" w:color="auto" w:fill="FFFFFF"/>
           </w:tcPr>
           <w:p>
@@ -680,12 +1009,29 @@
                 <w:color w:val="374151"/>
                 <w:sz w:val="20"/>
               </w:rPr>
-              <w:t>First Contentful Paint (FCP)</w:t>
-            </w:r>
-          </w:p>
-        </w:tc>
-        <w:tc>
-          <w:tcPr>
+              <w:t xml:space="preserve">First </w:t>
+            </w:r>
+            <w:proofErr w:type="spellStart"/>
+            <w:r>
+              <w:rPr>
+                <w:color w:val="374151"/>
+                <w:sz w:val="20"/>
+              </w:rPr>
+              <w:t>Contentful</w:t>
+            </w:r>
+            <w:proofErr w:type="spellEnd"/>
+            <w:r>
+              <w:rPr>
+                <w:color w:val="374151"/>
+                <w:sz w:val="20"/>
+              </w:rPr>
+              <w:t xml:space="preserve"> Paint (FCP)</w:t>
+            </w:r>
+          </w:p>
+        </w:tc>
+        <w:tc>
+          <w:tcPr>
+            <w:tcW w:w="0" w:type="auto"/>
             <w:shd w:val="clear" w:color="auto" w:fill="FFFFFF"/>
           </w:tcPr>
           <w:p>
@@ -703,6 +1049,7 @@
         </w:tc>
         <w:tc>
           <w:tcPr>
+            <w:tcW w:w="0" w:type="auto"/>
             <w:shd w:val="clear" w:color="auto" w:fill="FFFFFF"/>
           </w:tcPr>
           <w:p>
@@ -720,6 +1067,7 @@
         </w:tc>
         <w:tc>
           <w:tcPr>
+            <w:tcW w:w="0" w:type="auto"/>
             <w:shd w:val="clear" w:color="auto" w:fill="FFFFFF"/>
           </w:tcPr>
           <w:p>
@@ -737,6 +1085,7 @@
         </w:tc>
         <w:tc>
           <w:tcPr>
+            <w:tcW w:w="0" w:type="auto"/>
             <w:shd w:val="clear" w:color="auto" w:fill="FFFFFF"/>
           </w:tcPr>
           <w:p>
@@ -756,6 +1105,7 @@
       <w:tr>
         <w:tc>
           <w:tcPr>
+            <w:tcW w:w="0" w:type="auto"/>
             <w:shd w:val="clear" w:color="auto" w:fill="F9FAFB"/>
           </w:tcPr>
           <w:p>
@@ -767,12 +1117,29 @@
                 <w:color w:val="374151"/>
                 <w:sz w:val="20"/>
               </w:rPr>
-              <w:t>Largest Contentful Paint (LCP)</w:t>
-            </w:r>
-          </w:p>
-        </w:tc>
-        <w:tc>
-          <w:tcPr>
+              <w:t xml:space="preserve">Largest </w:t>
+            </w:r>
+            <w:proofErr w:type="spellStart"/>
+            <w:r>
+              <w:rPr>
+                <w:color w:val="374151"/>
+                <w:sz w:val="20"/>
+              </w:rPr>
+              <w:t>Contentful</w:t>
+            </w:r>
+            <w:proofErr w:type="spellEnd"/>
+            <w:r>
+              <w:rPr>
+                <w:color w:val="374151"/>
+                <w:sz w:val="20"/>
+              </w:rPr>
+              <w:t xml:space="preserve"> Paint (LCP)</w:t>
+            </w:r>
+          </w:p>
+        </w:tc>
+        <w:tc>
+          <w:tcPr>
+            <w:tcW w:w="0" w:type="auto"/>
             <w:shd w:val="clear" w:color="auto" w:fill="F9FAFB"/>
           </w:tcPr>
           <w:p>
@@ -790,6 +1157,7 @@
         </w:tc>
         <w:tc>
           <w:tcPr>
+            <w:tcW w:w="0" w:type="auto"/>
             <w:shd w:val="clear" w:color="auto" w:fill="F9FAFB"/>
           </w:tcPr>
           <w:p>
@@ -807,6 +1175,7 @@
         </w:tc>
         <w:tc>
           <w:tcPr>
+            <w:tcW w:w="0" w:type="auto"/>
             <w:shd w:val="clear" w:color="auto" w:fill="F9FAFB"/>
           </w:tcPr>
           <w:p>
@@ -824,6 +1193,7 @@
         </w:tc>
         <w:tc>
           <w:tcPr>
+            <w:tcW w:w="0" w:type="auto"/>
             <w:shd w:val="clear" w:color="auto" w:fill="F9FAFB"/>
           </w:tcPr>
           <w:p>
@@ -843,6 +1213,7 @@
       <w:tr>
         <w:tc>
           <w:tcPr>
+            <w:tcW w:w="0" w:type="auto"/>
             <w:shd w:val="clear" w:color="auto" w:fill="FFFFFF"/>
           </w:tcPr>
           <w:p>
@@ -860,6 +1231,7 @@
         </w:tc>
         <w:tc>
           <w:tcPr>
+            <w:tcW w:w="0" w:type="auto"/>
             <w:shd w:val="clear" w:color="auto" w:fill="FFFFFF"/>
           </w:tcPr>
           <w:p>
@@ -877,6 +1249,7 @@
         </w:tc>
         <w:tc>
           <w:tcPr>
+            <w:tcW w:w="0" w:type="auto"/>
             <w:shd w:val="clear" w:color="auto" w:fill="FFFFFF"/>
           </w:tcPr>
           <w:p>
@@ -894,6 +1267,7 @@
         </w:tc>
         <w:tc>
           <w:tcPr>
+            <w:tcW w:w="0" w:type="auto"/>
             <w:shd w:val="clear" w:color="auto" w:fill="FFFFFF"/>
           </w:tcPr>
           <w:p>
@@ -911,6 +1285,7 @@
         </w:tc>
         <w:tc>
           <w:tcPr>
+            <w:tcW w:w="0" w:type="auto"/>
             <w:shd w:val="clear" w:color="auto" w:fill="FFFFFF"/>
           </w:tcPr>
           <w:p>
@@ -930,6 +1305,7 @@
       <w:tr>
         <w:tc>
           <w:tcPr>
+            <w:tcW w:w="0" w:type="auto"/>
             <w:shd w:val="clear" w:color="auto" w:fill="F9FAFB"/>
           </w:tcPr>
           <w:p>
@@ -947,6 +1323,7 @@
         </w:tc>
         <w:tc>
           <w:tcPr>
+            <w:tcW w:w="0" w:type="auto"/>
             <w:shd w:val="clear" w:color="auto" w:fill="F9FAFB"/>
           </w:tcPr>
           <w:p>
@@ -958,12 +1335,22 @@
                 <w:color w:val="374151"/>
                 <w:sz w:val="20"/>
               </w:rPr>
-              <w:t>420 ms</w:t>
-            </w:r>
-          </w:p>
-        </w:tc>
-        <w:tc>
-          <w:tcPr>
+              <w:t xml:space="preserve">420 </w:t>
+            </w:r>
+            <w:proofErr w:type="spellStart"/>
+            <w:r>
+              <w:rPr>
+                <w:color w:val="374151"/>
+                <w:sz w:val="20"/>
+              </w:rPr>
+              <w:t>ms</w:t>
+            </w:r>
+            <w:proofErr w:type="spellEnd"/>
+          </w:p>
+        </w:tc>
+        <w:tc>
+          <w:tcPr>
+            <w:tcW w:w="0" w:type="auto"/>
             <w:shd w:val="clear" w:color="auto" w:fill="F9FAFB"/>
           </w:tcPr>
           <w:p>
@@ -975,12 +1362,22 @@
                 <w:color w:val="374151"/>
                 <w:sz w:val="20"/>
               </w:rPr>
-              <w:t>0 ms</w:t>
-            </w:r>
-          </w:p>
-        </w:tc>
-        <w:tc>
-          <w:tcPr>
+              <w:t xml:space="preserve">0 </w:t>
+            </w:r>
+            <w:proofErr w:type="spellStart"/>
+            <w:r>
+              <w:rPr>
+                <w:color w:val="374151"/>
+                <w:sz w:val="20"/>
+              </w:rPr>
+              <w:t>ms</w:t>
+            </w:r>
+            <w:proofErr w:type="spellEnd"/>
+          </w:p>
+        </w:tc>
+        <w:tc>
+          <w:tcPr>
+            <w:tcW w:w="0" w:type="auto"/>
             <w:shd w:val="clear" w:color="auto" w:fill="F9FAFB"/>
           </w:tcPr>
           <w:p>
@@ -998,6 +1395,7 @@
         </w:tc>
         <w:tc>
           <w:tcPr>
+            <w:tcW w:w="0" w:type="auto"/>
             <w:shd w:val="clear" w:color="auto" w:fill="F9FAFB"/>
           </w:tcPr>
           <w:p>
@@ -1009,7 +1407,23 @@
                 <w:color w:val="374151"/>
                 <w:sz w:val="20"/>
               </w:rPr>
-              <w:t>&lt; 200 ms (Good)</w:t>
+              <w:t xml:space="preserve">&lt; 200 </w:t>
+            </w:r>
+            <w:proofErr w:type="spellStart"/>
+            <w:r>
+              <w:rPr>
+                <w:color w:val="374151"/>
+                <w:sz w:val="20"/>
+              </w:rPr>
+              <w:t>ms</w:t>
+            </w:r>
+            <w:proofErr w:type="spellEnd"/>
+            <w:r>
+              <w:rPr>
+                <w:color w:val="374151"/>
+                <w:sz w:val="20"/>
+              </w:rPr>
+              <w:t xml:space="preserve"> (Good)</w:t>
             </w:r>
           </w:p>
         </w:tc>
@@ -1017,6 +1431,7 @@
       <w:tr>
         <w:tc>
           <w:tcPr>
+            <w:tcW w:w="0" w:type="auto"/>
             <w:shd w:val="clear" w:color="auto" w:fill="FFFFFF"/>
           </w:tcPr>
           <w:p>
@@ -1034,6 +1449,7 @@
         </w:tc>
         <w:tc>
           <w:tcPr>
+            <w:tcW w:w="0" w:type="auto"/>
             <w:shd w:val="clear" w:color="auto" w:fill="FFFFFF"/>
           </w:tcPr>
           <w:p>
@@ -1051,6 +1467,7 @@
         </w:tc>
         <w:tc>
           <w:tcPr>
+            <w:tcW w:w="0" w:type="auto"/>
             <w:shd w:val="clear" w:color="auto" w:fill="FFFFFF"/>
           </w:tcPr>
           <w:p>
@@ -1068,6 +1485,7 @@
         </w:tc>
         <w:tc>
           <w:tcPr>
+            <w:tcW w:w="0" w:type="auto"/>
             <w:shd w:val="clear" w:color="auto" w:fill="FFFFFF"/>
           </w:tcPr>
           <w:p>
@@ -1085,6 +1503,7 @@
         </w:tc>
         <w:tc>
           <w:tcPr>
+            <w:tcW w:w="0" w:type="auto"/>
             <w:shd w:val="clear" w:color="auto" w:fill="FFFFFF"/>
           </w:tcPr>
           <w:p>
@@ -1104,6 +1523,7 @@
       <w:tr>
         <w:tc>
           <w:tcPr>
+            <w:tcW w:w="0" w:type="auto"/>
             <w:shd w:val="clear" w:color="auto" w:fill="F9FAFB"/>
           </w:tcPr>
           <w:p>
@@ -1121,6 +1541,7 @@
         </w:tc>
         <w:tc>
           <w:tcPr>
+            <w:tcW w:w="0" w:type="auto"/>
             <w:shd w:val="clear" w:color="auto" w:fill="F9FAFB"/>
           </w:tcPr>
           <w:p>
@@ -1138,6 +1559,7 @@
         </w:tc>
         <w:tc>
           <w:tcPr>
+            <w:tcW w:w="0" w:type="auto"/>
             <w:shd w:val="clear" w:color="auto" w:fill="F9FAFB"/>
           </w:tcPr>
           <w:p>
@@ -1155,6 +1577,7 @@
         </w:tc>
         <w:tc>
           <w:tcPr>
+            <w:tcW w:w="0" w:type="auto"/>
             <w:shd w:val="clear" w:color="auto" w:fill="F9FAFB"/>
           </w:tcPr>
           <w:p>
@@ -1172,6 +1595,7 @@
         </w:tc>
         <w:tc>
           <w:tcPr>
+            <w:tcW w:w="0" w:type="auto"/>
             <w:shd w:val="clear" w:color="auto" w:fill="F9FAFB"/>
           </w:tcPr>
           <w:p>
@@ -1191,6 +1615,7 @@
       <w:tr>
         <w:tc>
           <w:tcPr>
+            <w:tcW w:w="0" w:type="auto"/>
             <w:shd w:val="clear" w:color="auto" w:fill="FFFFFF"/>
           </w:tcPr>
           <w:p>
@@ -1208,6 +1633,7 @@
         </w:tc>
         <w:tc>
           <w:tcPr>
+            <w:tcW w:w="0" w:type="auto"/>
             <w:shd w:val="clear" w:color="auto" w:fill="FFFFFF"/>
           </w:tcPr>
           <w:p>
@@ -1225,6 +1651,7 @@
         </w:tc>
         <w:tc>
           <w:tcPr>
+            <w:tcW w:w="0" w:type="auto"/>
             <w:shd w:val="clear" w:color="auto" w:fill="FFFFFF"/>
           </w:tcPr>
           <w:p>
@@ -1242,6 +1669,7 @@
         </w:tc>
         <w:tc>
           <w:tcPr>
+            <w:tcW w:w="0" w:type="auto"/>
             <w:shd w:val="clear" w:color="auto" w:fill="FFFFFF"/>
           </w:tcPr>
           <w:p>
@@ -1259,6 +1687,7 @@
         </w:tc>
         <w:tc>
           <w:tcPr>
+            <w:tcW w:w="0" w:type="auto"/>
             <w:shd w:val="clear" w:color="auto" w:fill="FFFFFF"/>
           </w:tcPr>
           <w:p>
@@ -1276,34 +1705,27 @@
         </w:tc>
       </w:tr>
     </w:tbl>
-    <w:p>
-      <w:pPr>
-        <w:spacing w:after="160"/>
-      </w:pPr>
-    </w:p>
-    <w:p>
-      <w:pPr>
-        <w:pStyle w:val="Heading1"/>
+    <w:p/>
+    <w:p>
+      <w:pPr>
         <w:spacing w:before="280" w:after="120"/>
       </w:pPr>
       <w:r>
         <w:rPr>
-          <w:rFonts w:ascii="Calibri" w:hAnsi="Calibri"/>
           <w:b/>
           <w:color w:val="1E3A8A"/>
           <w:sz w:val="32"/>
         </w:rPr>
+        <w:lastRenderedPageBreak/>
         <w:t>6. Key Technical Implementation Patterns</w:t>
       </w:r>
     </w:p>
     <w:p>
       <w:pPr>
-        <w:pStyle w:val="Heading2"/>
         <w:spacing w:before="200" w:after="80"/>
       </w:pPr>
       <w:r>
         <w:rPr>
-          <w:rFonts w:ascii="Calibri" w:hAnsi="Calibri"/>
           <w:b/>
           <w:color w:val="2563EB"/>
           <w:sz w:val="26"/>
@@ -1314,6 +1736,7 @@
     <w:tbl>
       <w:tblPr>
         <w:tblW w:w="9200" w:type="dxa"/>
+        <w:tblInd w:w="180" w:type="dxa"/>
         <w:tblBorders>
           <w:top w:val="single" w:sz="6" w:space="0" w:color="CBD5E1"/>
           <w:left w:val="single" w:sz="18" w:space="0" w:color="64748B"/>
@@ -1326,7 +1749,11 @@
           <w:bottom w:w="120" w:type="dxa"/>
           <w:right w:w="180" w:type="dxa"/>
         </w:tblCellMar>
+        <w:tblLook w:val="04A0" w:firstRow="1" w:lastRow="0" w:firstColumn="1" w:lastColumn="0" w:noHBand="0" w:noVBand="1"/>
       </w:tblPr>
+      <w:tblGrid>
+        <w:gridCol w:w="9200"/>
+      </w:tblGrid>
       <w:tr>
         <w:tc>
           <w:tcPr>
@@ -1337,13 +1764,23 @@
             <w:pPr>
               <w:spacing w:before="20" w:after="20"/>
             </w:pPr>
-            <w:r>
-              <w:rPr>
-                <w:rFonts w:ascii="Consolas" w:hAnsi="Consolas"/>
-                <w:color w:val="0F172A"/>
-                <w:sz w:val="18"/>
-              </w:rPr>
-              <w:t xml:space="preserve">&lt;!-- Preload Critical LCP Hero Asset with High Fetch Priority --&gt;</w:t>
+            <w:proofErr w:type="gramStart"/>
+            <w:r>
+              <w:rPr>
+                <w:rFonts w:ascii="Consolas" w:hAnsi="Consolas"/>
+                <w:color w:val="0F172A"/>
+                <w:sz w:val="18"/>
+              </w:rPr>
+              <w:t>&lt;!--</w:t>
+            </w:r>
+            <w:proofErr w:type="gramEnd"/>
+            <w:r>
+              <w:rPr>
+                <w:rFonts w:ascii="Consolas" w:hAnsi="Consolas"/>
+                <w:color w:val="0F172A"/>
+                <w:sz w:val="18"/>
+              </w:rPr>
+              <w:t xml:space="preserve"> Preload Critical LCP Hero Asset with High Fetch Priority --&gt;</w:t>
             </w:r>
           </w:p>
           <w:p>
@@ -1356,33 +1793,125 @@
                 <w:color w:val="0F172A"/>
                 <w:sz w:val="18"/>
               </w:rPr>
-              <w:t xml:space="preserve">&lt;link rel="preload" as="image" href="assets/hero-aura-pro.svg" fetchpriority="high"&gt;</w:t>
+              <w:t xml:space="preserve">&lt;link </w:t>
+            </w:r>
+            <w:proofErr w:type="spellStart"/>
+            <w:r>
+              <w:rPr>
+                <w:rFonts w:ascii="Consolas" w:hAnsi="Consolas"/>
+                <w:color w:val="0F172A"/>
+                <w:sz w:val="18"/>
+              </w:rPr>
+              <w:t>rel</w:t>
+            </w:r>
+            <w:proofErr w:type="spellEnd"/>
+            <w:r>
+              <w:rPr>
+                <w:rFonts w:ascii="Consolas" w:hAnsi="Consolas"/>
+                <w:color w:val="0F172A"/>
+                <w:sz w:val="18"/>
+              </w:rPr>
+              <w:t xml:space="preserve">="preload" as="image" </w:t>
+            </w:r>
+            <w:proofErr w:type="spellStart"/>
+            <w:r>
+              <w:rPr>
+                <w:rFonts w:ascii="Consolas" w:hAnsi="Consolas"/>
+                <w:color w:val="0F172A"/>
+                <w:sz w:val="18"/>
+              </w:rPr>
+              <w:t>href</w:t>
+            </w:r>
+            <w:proofErr w:type="spellEnd"/>
+            <w:r>
+              <w:rPr>
+                <w:rFonts w:ascii="Consolas" w:hAnsi="Consolas"/>
+                <w:color w:val="0F172A"/>
+                <w:sz w:val="18"/>
+              </w:rPr>
+              <w:t>="assets/hero-aura-</w:t>
+            </w:r>
+            <w:proofErr w:type="spellStart"/>
+            <w:r>
+              <w:rPr>
+                <w:rFonts w:ascii="Consolas" w:hAnsi="Consolas"/>
+                <w:color w:val="0F172A"/>
+                <w:sz w:val="18"/>
+              </w:rPr>
+              <w:t>pro.svg</w:t>
+            </w:r>
+            <w:proofErr w:type="spellEnd"/>
+            <w:r>
+              <w:rPr>
+                <w:rFonts w:ascii="Consolas" w:hAnsi="Consolas"/>
+                <w:color w:val="0F172A"/>
+                <w:sz w:val="18"/>
+              </w:rPr>
+              <w:t xml:space="preserve">" </w:t>
+            </w:r>
+            <w:proofErr w:type="spellStart"/>
+            <w:r>
+              <w:rPr>
+                <w:rFonts w:ascii="Consolas" w:hAnsi="Consolas"/>
+                <w:color w:val="0F172A"/>
+                <w:sz w:val="18"/>
+              </w:rPr>
+              <w:t>fetchpriority</w:t>
+            </w:r>
+            <w:proofErr w:type="spellEnd"/>
+            <w:r>
+              <w:rPr>
+                <w:rFonts w:ascii="Consolas" w:hAnsi="Consolas"/>
+                <w:color w:val="0F172A"/>
+                <w:sz w:val="18"/>
+              </w:rPr>
+              <w:t>="high"&gt;</w:t>
             </w:r>
           </w:p>
           <w:p>
             <w:pPr>
               <w:spacing w:before="20" w:after="20"/>
             </w:pPr>
-            <w:r>
-              <w:rPr>
-                <w:rFonts w:ascii="Consolas" w:hAnsi="Consolas"/>
-                <w:color w:val="0F172A"/>
-                <w:sz w:val="18"/>
-              </w:rPr>
-              <w:t xml:space="preserve"/>
-            </w:r>
           </w:p>
           <w:p>
             <w:pPr>
               <w:spacing w:before="20" w:after="20"/>
             </w:pPr>
-            <w:r>
-              <w:rPr>
-                <w:rFonts w:ascii="Consolas" w:hAnsi="Consolas"/>
-                <w:color w:val="0F172A"/>
-                <w:sz w:val="18"/>
-              </w:rPr>
-              <w:t xml:space="preserve">&lt;!-- Inlined Critical Above-the-fold CSS --&gt;</w:t>
+            <w:proofErr w:type="gramStart"/>
+            <w:r>
+              <w:rPr>
+                <w:rFonts w:ascii="Consolas" w:hAnsi="Consolas"/>
+                <w:color w:val="0F172A"/>
+                <w:sz w:val="18"/>
+              </w:rPr>
+              <w:t>&lt;!--</w:t>
+            </w:r>
+            <w:proofErr w:type="gramEnd"/>
+            <w:r>
+              <w:rPr>
+                <w:rFonts w:ascii="Consolas" w:hAnsi="Consolas"/>
+                <w:color w:val="0F172A"/>
+                <w:sz w:val="18"/>
+              </w:rPr>
+              <w:t xml:space="preserve"> </w:t>
+            </w:r>
+            <w:proofErr w:type="spellStart"/>
+            <w:r>
+              <w:rPr>
+                <w:rFonts w:ascii="Consolas" w:hAnsi="Consolas"/>
+                <w:color w:val="0F172A"/>
+                <w:sz w:val="18"/>
+              </w:rPr>
+              <w:t>Inlined</w:t>
+            </w:r>
+            <w:proofErr w:type="spellEnd"/>
+            <w:r>
+              <w:rPr>
+                <w:rFonts w:ascii="Consolas" w:hAnsi="Consolas"/>
+                <w:color w:val="0F172A"/>
+                <w:sz w:val="18"/>
+              </w:rPr>
+              <w:t xml:space="preserve"> Critical Above-the-fold CSS --&gt;</w:t>
             </w:r>
           </w:p>
           <w:p>
@@ -1395,7 +1924,7 @@
                 <w:color w:val="0F172A"/>
                 <w:sz w:val="18"/>
               </w:rPr>
-              <w:t xml:space="preserve">&lt;style&gt;</w:t>
+              <w:t>&lt;style&gt;</w:t>
             </w:r>
           </w:p>
           <w:p>
@@ -1408,8 +1937,64 @@
                 <w:color w:val="0F172A"/>
                 <w:sz w:val="18"/>
               </w:rPr>
-              <w:t xml:space="preserve">  :root { --bg-dark: #0b0f19; --accent-cyan: #06b6d4; }</w:t>
-            </w:r>
+              <w:t xml:space="preserve">  </w:t>
+            </w:r>
+            <w:proofErr w:type="gramStart"/>
+            <w:r>
+              <w:rPr>
+                <w:rFonts w:ascii="Consolas" w:hAnsi="Consolas"/>
+                <w:color w:val="0F172A"/>
+                <w:sz w:val="18"/>
+              </w:rPr>
+              <w:t>:root</w:t>
+            </w:r>
+            <w:proofErr w:type="gramEnd"/>
+            <w:r>
+              <w:rPr>
+                <w:rFonts w:ascii="Consolas" w:hAnsi="Consolas"/>
+                <w:color w:val="0F172A"/>
+                <w:sz w:val="18"/>
+              </w:rPr>
+              <w:t xml:space="preserve"> </w:t>
+            </w:r>
+            <w:proofErr w:type="gramStart"/>
+            <w:r>
+              <w:rPr>
+                <w:rFonts w:ascii="Consolas" w:hAnsi="Consolas"/>
+                <w:color w:val="0F172A"/>
+                <w:sz w:val="18"/>
+              </w:rPr>
+              <w:t>{ --</w:t>
+            </w:r>
+            <w:proofErr w:type="spellStart"/>
+            <w:proofErr w:type="gramEnd"/>
+            <w:r>
+              <w:rPr>
+                <w:rFonts w:ascii="Consolas" w:hAnsi="Consolas"/>
+                <w:color w:val="0F172A"/>
+                <w:sz w:val="18"/>
+              </w:rPr>
+              <w:t>bg</w:t>
+            </w:r>
+            <w:proofErr w:type="spellEnd"/>
+            <w:r>
+              <w:rPr>
+                <w:rFonts w:ascii="Consolas" w:hAnsi="Consolas"/>
+                <w:color w:val="0F172A"/>
+                <w:sz w:val="18"/>
+              </w:rPr>
+              <w:t>-dark: #0b0f19; --accent-cyan: #06b6d4</w:t>
+            </w:r>
+            <w:proofErr w:type="gramStart"/>
+            <w:r>
+              <w:rPr>
+                <w:rFonts w:ascii="Consolas" w:hAnsi="Consolas"/>
+                <w:color w:val="0F172A"/>
+                <w:sz w:val="18"/>
+              </w:rPr>
+              <w:t>; }</w:t>
+            </w:r>
+            <w:proofErr w:type="gramEnd"/>
           </w:p>
           <w:p>
             <w:pPr>
@@ -1421,8 +2006,54 @@
                 <w:color w:val="0F172A"/>
                 <w:sz w:val="18"/>
               </w:rPr>
-              <w:t xml:space="preserve">  .hero-media-wrapper { width: 100%; aspect-ratio: 800 / 500; overflow: hidden; }</w:t>
-            </w:r>
+              <w:t xml:space="preserve">  </w:t>
+            </w:r>
+            <w:proofErr w:type="gramStart"/>
+            <w:r>
+              <w:rPr>
+                <w:rFonts w:ascii="Consolas" w:hAnsi="Consolas"/>
+                <w:color w:val="0F172A"/>
+                <w:sz w:val="18"/>
+              </w:rPr>
+              <w:t>.hero</w:t>
+            </w:r>
+            <w:proofErr w:type="gramEnd"/>
+            <w:r>
+              <w:rPr>
+                <w:rFonts w:ascii="Consolas" w:hAnsi="Consolas"/>
+                <w:color w:val="0F172A"/>
+                <w:sz w:val="18"/>
+              </w:rPr>
+              <w:t xml:space="preserve">-media-wrapper </w:t>
+            </w:r>
+            <w:proofErr w:type="gramStart"/>
+            <w:r>
+              <w:rPr>
+                <w:rFonts w:ascii="Consolas" w:hAnsi="Consolas"/>
+                <w:color w:val="0F172A"/>
+                <w:sz w:val="18"/>
+              </w:rPr>
+              <w:t>{ width</w:t>
+            </w:r>
+            <w:proofErr w:type="gramEnd"/>
+            <w:r>
+              <w:rPr>
+                <w:rFonts w:ascii="Consolas" w:hAnsi="Consolas"/>
+                <w:color w:val="0F172A"/>
+                <w:sz w:val="18"/>
+              </w:rPr>
+              <w:t>: 100%; aspect-ratio: 800 / 500; overflow: hidden</w:t>
+            </w:r>
+            <w:proofErr w:type="gramStart"/>
+            <w:r>
+              <w:rPr>
+                <w:rFonts w:ascii="Consolas" w:hAnsi="Consolas"/>
+                <w:color w:val="0F172A"/>
+                <w:sz w:val="18"/>
+              </w:rPr>
+              <w:t>; }</w:t>
+            </w:r>
+            <w:proofErr w:type="gramEnd"/>
           </w:p>
           <w:p>
             <w:pPr>
@@ -1434,7 +2065,7 @@
                 <w:color w:val="0F172A"/>
                 <w:sz w:val="18"/>
               </w:rPr>
-              <w:t xml:space="preserve">&lt;/style&gt;</w:t>
+              <w:t>&lt;/style&gt;</w:t>
             </w:r>
           </w:p>
         </w:tc>
@@ -1447,22 +2078,39 @@
     </w:p>
     <w:p>
       <w:pPr>
-        <w:pStyle w:val="Heading2"/>
         <w:spacing w:before="200" w:after="80"/>
       </w:pPr>
       <w:r>
         <w:rPr>
-          <w:rFonts w:ascii="Calibri" w:hAnsi="Calibri"/>
           <w:b/>
           <w:color w:val="2563EB"/>
           <w:sz w:val="26"/>
         </w:rPr>
-        <w:t>6.2 Native PerformanceObserver Telemetry Controller</w:t>
+        <w:t xml:space="preserve">6.2 Native </w:t>
+      </w:r>
+      <w:proofErr w:type="spellStart"/>
+      <w:r>
+        <w:rPr>
+          <w:b/>
+          <w:color w:val="2563EB"/>
+          <w:sz w:val="26"/>
+        </w:rPr>
+        <w:t>PerformanceObserver</w:t>
+      </w:r>
+      <w:proofErr w:type="spellEnd"/>
+      <w:r>
+        <w:rPr>
+          <w:b/>
+          <w:color w:val="2563EB"/>
+          <w:sz w:val="26"/>
+        </w:rPr>
+        <w:t xml:space="preserve"> Telemetry Controller</w:t>
       </w:r>
     </w:p>
     <w:tbl>
       <w:tblPr>
         <w:tblW w:w="9200" w:type="dxa"/>
+        <w:tblInd w:w="180" w:type="dxa"/>
         <w:tblBorders>
           <w:top w:val="single" w:sz="6" w:space="0" w:color="CBD5E1"/>
           <w:left w:val="single" w:sz="18" w:space="0" w:color="64748B"/>
@@ -1475,7 +2123,11 @@
           <w:bottom w:w="120" w:type="dxa"/>
           <w:right w:w="180" w:type="dxa"/>
         </w:tblCellMar>
+        <w:tblLook w:val="04A0" w:firstRow="1" w:lastRow="0" w:firstColumn="1" w:lastColumn="0" w:noHBand="0" w:noVBand="1"/>
       </w:tblPr>
+      <w:tblGrid>
+        <w:gridCol w:w="9200"/>
+      </w:tblGrid>
       <w:tr>
         <w:tc>
           <w:tcPr>
@@ -1492,7 +2144,7 @@
                 <w:color w:val="0F172A"/>
                 <w:sz w:val="18"/>
               </w:rPr>
-              <w:t xml:space="preserve">// Live LCP Observer capturing real-time user timing</w:t>
+              <w:t>// Live LCP Observer capturing real-time user timing</w:t>
             </w:r>
           </w:p>
           <w:p>
@@ -1505,7 +2157,61 @@
                 <w:color w:val="0F172A"/>
                 <w:sz w:val="18"/>
               </w:rPr>
-              <w:t xml:space="preserve">const lcpObserver = new PerformanceObserver((entryList) =&gt; {</w:t>
+              <w:t xml:space="preserve">const </w:t>
+            </w:r>
+            <w:proofErr w:type="spellStart"/>
+            <w:r>
+              <w:rPr>
+                <w:rFonts w:ascii="Consolas" w:hAnsi="Consolas"/>
+                <w:color w:val="0F172A"/>
+                <w:sz w:val="18"/>
+              </w:rPr>
+              <w:t>lcpObserver</w:t>
+            </w:r>
+            <w:proofErr w:type="spellEnd"/>
+            <w:r>
+              <w:rPr>
+                <w:rFonts w:ascii="Consolas" w:hAnsi="Consolas"/>
+                <w:color w:val="0F172A"/>
+                <w:sz w:val="18"/>
+              </w:rPr>
+              <w:t xml:space="preserve"> = new </w:t>
+            </w:r>
+            <w:proofErr w:type="spellStart"/>
+            <w:r>
+              <w:rPr>
+                <w:rFonts w:ascii="Consolas" w:hAnsi="Consolas"/>
+                <w:color w:val="0F172A"/>
+                <w:sz w:val="18"/>
+              </w:rPr>
+              <w:t>PerformanceObserver</w:t>
+            </w:r>
+            <w:proofErr w:type="spellEnd"/>
+            <w:r>
+              <w:rPr>
+                <w:rFonts w:ascii="Consolas" w:hAnsi="Consolas"/>
+                <w:color w:val="0F172A"/>
+                <w:sz w:val="18"/>
+              </w:rPr>
+              <w:t>((</w:t>
+            </w:r>
+            <w:proofErr w:type="spellStart"/>
+            <w:r>
+              <w:rPr>
+                <w:rFonts w:ascii="Consolas" w:hAnsi="Consolas"/>
+                <w:color w:val="0F172A"/>
+                <w:sz w:val="18"/>
+              </w:rPr>
+              <w:t>entryList</w:t>
+            </w:r>
+            <w:proofErr w:type="spellEnd"/>
+            <w:r>
+              <w:rPr>
+                <w:rFonts w:ascii="Consolas" w:hAnsi="Consolas"/>
+                <w:color w:val="0F172A"/>
+                <w:sz w:val="18"/>
+              </w:rPr>
+              <w:t>) =&gt; {</w:t>
             </w:r>
           </w:p>
           <w:p>
@@ -1518,7 +2224,25 @@
                 <w:color w:val="0F172A"/>
                 <w:sz w:val="18"/>
               </w:rPr>
-              <w:t xml:space="preserve">  const entries = entryList.getEntries();</w:t>
+              <w:t xml:space="preserve">  const entries = </w:t>
+            </w:r>
+            <w:proofErr w:type="spellStart"/>
+            <w:r>
+              <w:rPr>
+                <w:rFonts w:ascii="Consolas" w:hAnsi="Consolas"/>
+                <w:color w:val="0F172A"/>
+                <w:sz w:val="18"/>
+              </w:rPr>
+              <w:t>entryList.getEntries</w:t>
+            </w:r>
+            <w:proofErr w:type="spellEnd"/>
+            <w:r>
+              <w:rPr>
+                <w:rFonts w:ascii="Consolas" w:hAnsi="Consolas"/>
+                <w:color w:val="0F172A"/>
+                <w:sz w:val="18"/>
+              </w:rPr>
+              <w:t>();</w:t>
             </w:r>
           </w:p>
           <w:p>
@@ -1531,7 +2255,27 @@
                 <w:color w:val="0F172A"/>
                 <w:sz w:val="18"/>
               </w:rPr>
-              <w:t xml:space="preserve">  if (entries.length &gt; 0) {</w:t>
+              <w:t xml:space="preserve">  if (</w:t>
+            </w:r>
+            <w:proofErr w:type="spellStart"/>
+            <w:proofErr w:type="gramStart"/>
+            <w:r>
+              <w:rPr>
+                <w:rFonts w:ascii="Consolas" w:hAnsi="Consolas"/>
+                <w:color w:val="0F172A"/>
+                <w:sz w:val="18"/>
+              </w:rPr>
+              <w:t>entries.length</w:t>
+            </w:r>
+            <w:proofErr w:type="spellEnd"/>
+            <w:proofErr w:type="gramEnd"/>
+            <w:r>
+              <w:rPr>
+                <w:rFonts w:ascii="Consolas" w:hAnsi="Consolas"/>
+                <w:color w:val="0F172A"/>
+                <w:sz w:val="18"/>
+              </w:rPr>
+              <w:t xml:space="preserve"> &gt; 0) {</w:t>
             </w:r>
           </w:p>
           <w:p>
@@ -1544,7 +2288,53 @@
                 <w:color w:val="0F172A"/>
                 <w:sz w:val="18"/>
               </w:rPr>
-              <w:t xml:space="preserve">    const lastEntry = entries[entries.length - 1];</w:t>
+              <w:t xml:space="preserve">    const </w:t>
+            </w:r>
+            <w:proofErr w:type="spellStart"/>
+            <w:r>
+              <w:rPr>
+                <w:rFonts w:ascii="Consolas" w:hAnsi="Consolas"/>
+                <w:color w:val="0F172A"/>
+                <w:sz w:val="18"/>
+              </w:rPr>
+              <w:t>lastEntry</w:t>
+            </w:r>
+            <w:proofErr w:type="spellEnd"/>
+            <w:r>
+              <w:rPr>
+                <w:rFonts w:ascii="Consolas" w:hAnsi="Consolas"/>
+                <w:color w:val="0F172A"/>
+                <w:sz w:val="18"/>
+              </w:rPr>
+              <w:t xml:space="preserve"> = </w:t>
+            </w:r>
+            <w:proofErr w:type="gramStart"/>
+            <w:r>
+              <w:rPr>
+                <w:rFonts w:ascii="Consolas" w:hAnsi="Consolas"/>
+                <w:color w:val="0F172A"/>
+                <w:sz w:val="18"/>
+              </w:rPr>
+              <w:t>entries[</w:t>
+            </w:r>
+            <w:proofErr w:type="spellStart"/>
+            <w:r>
+              <w:rPr>
+                <w:rFonts w:ascii="Consolas" w:hAnsi="Consolas"/>
+                <w:color w:val="0F172A"/>
+                <w:sz w:val="18"/>
+              </w:rPr>
+              <w:t>entries.length</w:t>
+            </w:r>
+            <w:proofErr w:type="spellEnd"/>
+            <w:proofErr w:type="gramEnd"/>
+            <w:r>
+              <w:rPr>
+                <w:rFonts w:ascii="Consolas" w:hAnsi="Consolas"/>
+                <w:color w:val="0F172A"/>
+                <w:sz w:val="18"/>
+              </w:rPr>
+              <w:t xml:space="preserve"> - 1];</w:t>
             </w:r>
           </w:p>
           <w:p>
@@ -1557,7 +2347,71 @@
                 <w:color w:val="0F172A"/>
                 <w:sz w:val="18"/>
               </w:rPr>
-              <w:t xml:space="preserve">    const lcpSeconds = (lastEntry.startTime / 1000).toFixed(2);</w:t>
+              <w:t xml:space="preserve">    const </w:t>
+            </w:r>
+            <w:proofErr w:type="spellStart"/>
+            <w:r>
+              <w:rPr>
+                <w:rFonts w:ascii="Consolas" w:hAnsi="Consolas"/>
+                <w:color w:val="0F172A"/>
+                <w:sz w:val="18"/>
+              </w:rPr>
+              <w:t>lcpSeconds</w:t>
+            </w:r>
+            <w:proofErr w:type="spellEnd"/>
+            <w:r>
+              <w:rPr>
+                <w:rFonts w:ascii="Consolas" w:hAnsi="Consolas"/>
+                <w:color w:val="0F172A"/>
+                <w:sz w:val="18"/>
+              </w:rPr>
+              <w:t xml:space="preserve"> = (</w:t>
+            </w:r>
+            <w:proofErr w:type="spellStart"/>
+            <w:r>
+              <w:rPr>
+                <w:rFonts w:ascii="Consolas" w:hAnsi="Consolas"/>
+                <w:color w:val="0F172A"/>
+                <w:sz w:val="18"/>
+              </w:rPr>
+              <w:t>lastEntry.startTime</w:t>
+            </w:r>
+            <w:proofErr w:type="spellEnd"/>
+            <w:r>
+              <w:rPr>
+                <w:rFonts w:ascii="Consolas" w:hAnsi="Consolas"/>
+                <w:color w:val="0F172A"/>
+                <w:sz w:val="18"/>
+              </w:rPr>
+              <w:t xml:space="preserve"> / 1000</w:t>
+            </w:r>
+            <w:proofErr w:type="gramStart"/>
+            <w:r>
+              <w:rPr>
+                <w:rFonts w:ascii="Consolas" w:hAnsi="Consolas"/>
+                <w:color w:val="0F172A"/>
+                <w:sz w:val="18"/>
+              </w:rPr>
+              <w:t>).</w:t>
+            </w:r>
+            <w:proofErr w:type="spellStart"/>
+            <w:r>
+              <w:rPr>
+                <w:rFonts w:ascii="Consolas" w:hAnsi="Consolas"/>
+                <w:color w:val="0F172A"/>
+                <w:sz w:val="18"/>
+              </w:rPr>
+              <w:t>toFixed</w:t>
+            </w:r>
+            <w:proofErr w:type="spellEnd"/>
+            <w:proofErr w:type="gramEnd"/>
+            <w:r>
+              <w:rPr>
+                <w:rFonts w:ascii="Consolas" w:hAnsi="Consolas"/>
+                <w:color w:val="0F172A"/>
+                <w:sz w:val="18"/>
+              </w:rPr>
+              <w:t>(2);</w:t>
             </w:r>
           </w:p>
           <w:p>
@@ -1570,7 +2424,25 @@
                 <w:color w:val="0F172A"/>
                 <w:sz w:val="18"/>
               </w:rPr>
-              <w:t xml:space="preserve">    console.log(`[Telemetry] Measured LCP: ${lcpSeconds}s`);</w:t>
+              <w:t xml:space="preserve">    console.log(`[Telemetry] Measured LCP: ${</w:t>
+            </w:r>
+            <w:proofErr w:type="spellStart"/>
+            <w:r>
+              <w:rPr>
+                <w:rFonts w:ascii="Consolas" w:hAnsi="Consolas"/>
+                <w:color w:val="0F172A"/>
+                <w:sz w:val="18"/>
+              </w:rPr>
+              <w:t>lcpSeconds</w:t>
+            </w:r>
+            <w:proofErr w:type="spellEnd"/>
+            <w:r>
+              <w:rPr>
+                <w:rFonts w:ascii="Consolas" w:hAnsi="Consolas"/>
+                <w:color w:val="0F172A"/>
+                <w:sz w:val="18"/>
+              </w:rPr>
+              <w:t>}s`);</w:t>
             </w:r>
           </w:p>
           <w:p>
@@ -1596,20 +2468,58 @@
                 <w:color w:val="0F172A"/>
                 <w:sz w:val="18"/>
               </w:rPr>
-              <w:t xml:space="preserve">});</w:t>
+              <w:t>});</w:t>
             </w:r>
           </w:p>
           <w:p>
             <w:pPr>
               <w:spacing w:before="20" w:after="20"/>
             </w:pPr>
-            <w:r>
-              <w:rPr>
-                <w:rFonts w:ascii="Consolas" w:hAnsi="Consolas"/>
-                <w:color w:val="0F172A"/>
-                <w:sz w:val="18"/>
-              </w:rPr>
-              <w:t xml:space="preserve">lcpObserver.observe({ type: 'largest-contentful-paint', buffered: true });</w:t>
+            <w:proofErr w:type="spellStart"/>
+            <w:r>
+              <w:rPr>
+                <w:rFonts w:ascii="Consolas" w:hAnsi="Consolas"/>
+                <w:color w:val="0F172A"/>
+                <w:sz w:val="18"/>
+              </w:rPr>
+              <w:t>lcpObserver.observe</w:t>
+            </w:r>
+            <w:proofErr w:type="spellEnd"/>
+            <w:proofErr w:type="gramStart"/>
+            <w:r>
+              <w:rPr>
+                <w:rFonts w:ascii="Consolas" w:hAnsi="Consolas"/>
+                <w:color w:val="0F172A"/>
+                <w:sz w:val="18"/>
+              </w:rPr>
+              <w:t>({ type</w:t>
+            </w:r>
+            <w:proofErr w:type="gramEnd"/>
+            <w:r>
+              <w:rPr>
+                <w:rFonts w:ascii="Consolas" w:hAnsi="Consolas"/>
+                <w:color w:val="0F172A"/>
+                <w:sz w:val="18"/>
+              </w:rPr>
+              <w:t>: 'largest-</w:t>
+            </w:r>
+            <w:proofErr w:type="spellStart"/>
+            <w:r>
+              <w:rPr>
+                <w:rFonts w:ascii="Consolas" w:hAnsi="Consolas"/>
+                <w:color w:val="0F172A"/>
+                <w:sz w:val="18"/>
+              </w:rPr>
+              <w:t>contentful</w:t>
+            </w:r>
+            <w:proofErr w:type="spellEnd"/>
+            <w:r>
+              <w:rPr>
+                <w:rFonts w:ascii="Consolas" w:hAnsi="Consolas"/>
+                <w:color w:val="0F172A"/>
+                <w:sz w:val="18"/>
+              </w:rPr>
+              <w:t>-paint', buffered: true });</w:t>
             </w:r>
           </w:p>
         </w:tc>
@@ -1622,12 +2532,10 @@
     </w:p>
     <w:p>
       <w:pPr>
-        <w:pStyle w:val="Heading1"/>
         <w:spacing w:before="280" w:after="120"/>
       </w:pPr>
       <w:r>
         <w:rPr>
-          <w:rFonts w:ascii="Calibri" w:hAnsi="Calibri"/>
           <w:b/>
           <w:color w:val="1E3A8A"/>
           <w:sz w:val="32"/>
@@ -1641,82 +2549,40 @@
       </w:pPr>
       <w:r>
         <w:rPr>
-          <w:rFonts w:ascii="Calibri" w:hAnsi="Calibri"/>
-          <w:color w:val="374151"/>
-          <w:sz w:val="22"/>
+          <w:color w:val="374151"/>
         </w:rPr>
         <w:t>During the execution of the Week 4 Performance Optimization Challenge, several complex technical trade-offs were encountered and methodically solved:</w:t>
       </w:r>
     </w:p>
     <w:p>
       <w:pPr>
-        <w:pStyle w:val="Heading2"/>
         <w:spacing w:before="200" w:after="80"/>
       </w:pPr>
       <w:r>
         <w:rPr>
-          <w:rFonts w:ascii="Calibri" w:hAnsi="Calibri"/>
           <w:b/>
           <w:color w:val="2563EB"/>
           <w:sz w:val="26"/>
         </w:rPr>
-        <w:t>7.1 Challenge 1: Flash of Unstyled Content (FOUC) vs Critical Path Speed</w:t>
-      </w:r>
-    </w:p>
-    <w:p>
-      <w:pPr>
-        <w:spacing w:after="120" w:line="276" w:lineRule="auto"/>
-      </w:pPr>
-      <w:r>
-        <w:rPr>
-          <w:rFonts w:ascii="Calibri" w:hAnsi="Calibri"/>
-          <w:color w:val="374151"/>
-          <w:sz w:val="22"/>
-        </w:rPr>
-        <w:t>Deferring secondary stylesheets asynchronously can introduce a visual 'flash' when late-loading rules apply to rendered elements. To resolve this without sacrificing First Contentful Paint, the exact layout boundaries of all cards and sections were encoded into the inlined critical CSS (&lt; 8KB). A progressive &lt;noscript&gt; fallback was paired with rel='preload' as='style', ensuring seamless visual continuity and zero render-blocking penalties.</w:t>
-      </w:r>
-    </w:p>
-    <w:p>
-      <w:pPr>
-        <w:pStyle w:val="Heading2"/>
-        <w:spacing w:before="200" w:after="80"/>
-      </w:pPr>
-      <w:r>
-        <w:rPr>
-          <w:rFonts w:ascii="Calibri" w:hAnsi="Calibri"/>
+        <w:t xml:space="preserve">7.1 Challenge 1: Flash of </w:t>
+      </w:r>
+      <w:proofErr w:type="spellStart"/>
+      <w:r>
+        <w:rPr>
           <w:b/>
           <w:color w:val="2563EB"/>
           <w:sz w:val="26"/>
         </w:rPr>
-        <w:t>7.2 Challenge 2: Eliminating Cumulative Layout Shift (CLS) Across Viewports</w:t>
-      </w:r>
-    </w:p>
-    <w:p>
-      <w:pPr>
-        <w:spacing w:after="120" w:line="276" w:lineRule="auto"/>
-      </w:pPr>
-      <w:r>
-        <w:rPr>
-          <w:rFonts w:ascii="Calibri" w:hAnsi="Calibri"/>
-          <w:color w:val="374151"/>
-          <w:sz w:val="22"/>
-        </w:rPr>
-        <w:t>High-DPI responsive images often cause content displacement while downloading on mobile devices. This was eliminated by enforcing dual-layer geometry: declaring intrinsic width and height attributes in HTML alongside modern CSS aspect-ratio rules (800 / 500 for the Hero, and 400 / 300 for product cards). The browser allocates layout space before receiving image bytes, achieving a CLS of 0.000.</w:t>
-      </w:r>
-    </w:p>
-    <w:p>
-      <w:pPr>
-        <w:pStyle w:val="Heading2"/>
-        <w:spacing w:before="200" w:after="80"/>
-      </w:pPr>
-      <w:r>
-        <w:rPr>
-          <w:rFonts w:ascii="Calibri" w:hAnsi="Calibri"/>
+        <w:t>Unstyled</w:t>
+      </w:r>
+      <w:proofErr w:type="spellEnd"/>
+      <w:r>
+        <w:rPr>
           <w:b/>
           <w:color w:val="2563EB"/>
           <w:sz w:val="26"/>
         </w:rPr>
-        <w:t>7.3 Challenge 3: Real-Time Telemetry Without Main-Thread Contention</w:t>
+        <w:t xml:space="preserve"> Content (FOUC) vs Critical Path Speed</w:t>
       </w:r>
     </w:p>
     <w:p>
@@ -1725,25 +2591,170 @@
       </w:pPr>
       <w:r>
         <w:rPr>
-          <w:rFonts w:ascii="Calibri" w:hAnsi="Calibri"/>
-          <w:color w:val="374151"/>
-          <w:sz w:val="22"/>
-        </w:rPr>
-        <w:t>Capturing real-time Core Web Vitals using polling can ironically degrade the very performance being measured. To avoid main-thread overhead, native asynchronous PerformanceObserver entries were leveraged for buffered paint, LCP, and layout-shift events. All DOM mutations and scroll listeners were synchronized with hardware display refreshes using window.requestAnimationFrame, maintaining a Total Blocking Time (TBT) of 0 ms.</w:t>
-      </w:r>
-    </w:p>
-    <w:p>
-      <w:pPr>
-        <w:pStyle w:val="Heading2"/>
+          <w:color w:val="374151"/>
+        </w:rPr>
+        <w:t xml:space="preserve">Deferring secondary stylesheets asynchronously can introduce a visual 'flash' when late-loading rules apply to rendered elements. To resolve this without sacrificing First </w:t>
+      </w:r>
+      <w:proofErr w:type="spellStart"/>
+      <w:r>
+        <w:rPr>
+          <w:color w:val="374151"/>
+        </w:rPr>
+        <w:t>Contentful</w:t>
+      </w:r>
+      <w:proofErr w:type="spellEnd"/>
+      <w:r>
+        <w:rPr>
+          <w:color w:val="374151"/>
+        </w:rPr>
+        <w:t xml:space="preserve"> Paint, the exact layout boundaries of all cards and sections were encoded into the </w:t>
+      </w:r>
+      <w:proofErr w:type="spellStart"/>
+      <w:r>
+        <w:rPr>
+          <w:color w:val="374151"/>
+        </w:rPr>
+        <w:t>inlined</w:t>
+      </w:r>
+      <w:proofErr w:type="spellEnd"/>
+      <w:r>
+        <w:rPr>
+          <w:color w:val="374151"/>
+        </w:rPr>
+        <w:t xml:space="preserve"> critical CSS (&lt; 8KB). A progressive &lt;</w:t>
+      </w:r>
+      <w:proofErr w:type="spellStart"/>
+      <w:r>
+        <w:rPr>
+          <w:color w:val="374151"/>
+        </w:rPr>
+        <w:t>noscript</w:t>
+      </w:r>
+      <w:proofErr w:type="spellEnd"/>
+      <w:r>
+        <w:rPr>
+          <w:color w:val="374151"/>
+        </w:rPr>
+        <w:t xml:space="preserve">&gt; fallback was paired with </w:t>
+      </w:r>
+      <w:proofErr w:type="spellStart"/>
+      <w:r>
+        <w:rPr>
+          <w:color w:val="374151"/>
+        </w:rPr>
+        <w:t>rel</w:t>
+      </w:r>
+      <w:proofErr w:type="spellEnd"/>
+      <w:r>
+        <w:rPr>
+          <w:color w:val="374151"/>
+        </w:rPr>
+        <w:t>='preload' as='style', ensuring seamless visual continuity and zero render-blocking penalties.</w:t>
+      </w:r>
+    </w:p>
+    <w:p>
+      <w:pPr>
         <w:spacing w:before="200" w:after="80"/>
       </w:pPr>
       <w:r>
         <w:rPr>
-          <w:rFonts w:ascii="Calibri" w:hAnsi="Calibri"/>
           <w:b/>
           <w:color w:val="2563EB"/>
           <w:sz w:val="26"/>
         </w:rPr>
+        <w:t>7.2 Challenge 2: Eliminating Cumulative Layout Shift (CLS) Across Viewports</w:t>
+      </w:r>
+    </w:p>
+    <w:p>
+      <w:pPr>
+        <w:spacing w:after="120" w:line="276" w:lineRule="auto"/>
+      </w:pPr>
+      <w:r>
+        <w:rPr>
+          <w:color w:val="374151"/>
+        </w:rPr>
+        <w:t xml:space="preserve">High-DPI responsive images often cause content displacement while downloading on mobile devices. This was eliminated by enforcing dual-layer geometry: declaring intrinsic width and height attributes in </w:t>
+      </w:r>
+      <w:r>
+        <w:rPr>
+          <w:color w:val="374151"/>
+        </w:rPr>
+        <w:lastRenderedPageBreak/>
+        <w:t>HTML alongside modern CSS aspect-ratio rules (800 / 500 for the Hero, and 400 / 300 for product cards). The browser allocates layout space before receiving image bytes, achieving a CLS of 0.000.</w:t>
+      </w:r>
+    </w:p>
+    <w:p>
+      <w:pPr>
+        <w:spacing w:before="200" w:after="80"/>
+      </w:pPr>
+      <w:r>
+        <w:rPr>
+          <w:b/>
+          <w:color w:val="2563EB"/>
+          <w:sz w:val="26"/>
+        </w:rPr>
+        <w:t>7.3 Challenge 3: Real-Time Telemetry Without Main-Thread Contention</w:t>
+      </w:r>
+    </w:p>
+    <w:p>
+      <w:pPr>
+        <w:spacing w:after="120" w:line="276" w:lineRule="auto"/>
+      </w:pPr>
+      <w:r>
+        <w:rPr>
+          <w:color w:val="374151"/>
+        </w:rPr>
+        <w:t xml:space="preserve">Capturing real-time Core Web Vitals using polling can ironically degrade the very performance being measured. To avoid main-thread overhead, native asynchronous </w:t>
+      </w:r>
+      <w:proofErr w:type="spellStart"/>
+      <w:r>
+        <w:rPr>
+          <w:color w:val="374151"/>
+        </w:rPr>
+        <w:t>PerformanceObserver</w:t>
+      </w:r>
+      <w:proofErr w:type="spellEnd"/>
+      <w:r>
+        <w:rPr>
+          <w:color w:val="374151"/>
+        </w:rPr>
+        <w:t xml:space="preserve"> entries were leveraged for buffered paint, LCP, and layout-shift events. All DOM mutations and scroll listeners were synchronized with hardware display refreshes using </w:t>
+      </w:r>
+      <w:proofErr w:type="spellStart"/>
+      <w:proofErr w:type="gramStart"/>
+      <w:r>
+        <w:rPr>
+          <w:color w:val="374151"/>
+        </w:rPr>
+        <w:t>window.requestAnimationFrame</w:t>
+      </w:r>
+      <w:proofErr w:type="spellEnd"/>
+      <w:proofErr w:type="gramEnd"/>
+      <w:r>
+        <w:rPr>
+          <w:color w:val="374151"/>
+        </w:rPr>
+        <w:t xml:space="preserve">, maintaining a Total Blocking Time (TBT) of 0 </w:t>
+      </w:r>
+      <w:proofErr w:type="spellStart"/>
+      <w:r>
+        <w:rPr>
+          <w:color w:val="374151"/>
+        </w:rPr>
+        <w:t>ms.</w:t>
+      </w:r>
+      <w:proofErr w:type="spellEnd"/>
+    </w:p>
+    <w:p>
+      <w:pPr>
+        <w:spacing w:before="200" w:after="80"/>
+      </w:pPr>
+      <w:r>
+        <w:rPr>
+          <w:b/>
+          <w:color w:val="2563EB"/>
+          <w:sz w:val="26"/>
+        </w:rPr>
         <w:t>7.4 Challenge 4: High-Fidelity Commercial Photography vs Network Payload</w:t>
       </w:r>
     </w:p>
@@ -1753,21 +2764,17 @@
       </w:pPr>
       <w:r>
         <w:rPr>
-          <w:rFonts w:ascii="Calibri" w:hAnsi="Calibri"/>
-          <w:color w:val="374151"/>
-          <w:sz w:val="22"/>
+          <w:color w:val="374151"/>
         </w:rPr>
         <w:t>Studio-grade product photography can easily inflate transfer sizes beyond acceptable mobile thresholds (&gt; 3 MB). To reconcile commercial realism with instant speed, assets were resampled using high-efficiency bicubic compression (85% quality factor) and configured with native loading='lazy' on secondary cards, reducing the total image payload to ~115 KB while maintaining razor-sharp visual fidelity.</w:t>
       </w:r>
     </w:p>
     <w:p>
       <w:pPr>
-        <w:pStyle w:val="Heading1"/>
         <w:spacing w:before="280" w:after="120"/>
       </w:pPr>
       <w:r>
         <w:rPr>
-          <w:rFonts w:ascii="Calibri" w:hAnsi="Calibri"/>
           <w:b/>
           <w:color w:val="1E3A8A"/>
           <w:sz w:val="32"/>
@@ -1781,23 +2788,48 @@
       </w:pPr>
       <w:r>
         <w:rPr>
-          <w:rFonts w:ascii="Calibri" w:hAnsi="Calibri"/>
-          <w:color w:val="374151"/>
-          <w:sz w:val="22"/>
-        </w:rPr>
-        <w:t>The optimized Aura Media &amp; Product Showcase was audited using Google Chrome DevTools, Lighthouse 10, and WebPageTest. The project achieved:</w:t>
-      </w:r>
-    </w:p>
-    <w:p>
-      <w:pPr>
-        <w:pStyle w:val="ListParagraph"/>
+          <w:color w:val="374151"/>
+        </w:rPr>
+        <w:t xml:space="preserve">The optimized Aura Media &amp; Product Showcase was audited using Google Chrome </w:t>
+      </w:r>
+      <w:proofErr w:type="spellStart"/>
+      <w:r>
+        <w:rPr>
+          <w:color w:val="374151"/>
+        </w:rPr>
+        <w:t>DevTools</w:t>
+      </w:r>
+      <w:proofErr w:type="spellEnd"/>
+      <w:r>
+        <w:rPr>
+          <w:color w:val="374151"/>
+        </w:rPr>
+        <w:t xml:space="preserve">, Lighthouse 10, and </w:t>
+      </w:r>
+      <w:proofErr w:type="spellStart"/>
+      <w:r>
+        <w:rPr>
+          <w:color w:val="374151"/>
+        </w:rPr>
+        <w:t>WebPageTest</w:t>
+      </w:r>
+      <w:proofErr w:type="spellEnd"/>
+      <w:r>
+        <w:rPr>
+          <w:color w:val="374151"/>
+        </w:rPr>
+        <w:t>. The project achieved:</w:t>
+      </w:r>
+    </w:p>
+    <w:p>
+      <w:pPr>
         <w:spacing w:after="80"/>
         <w:ind w:left="360"/>
       </w:pPr>
       <w:r>
         <w:rPr>
+          <w:b/>
           <w:color w:val="2563EB"/>
-          <w:b/>
         </w:rPr>
         <w:t xml:space="preserve">•  </w:t>
       </w:r>
@@ -1805,29 +2837,25 @@
         <w:rPr>
           <w:b/>
           <w:color w:val="1F2937"/>
-          <w:sz w:val="22"/>
         </w:rPr>
         <w:t xml:space="preserve">Lighthouse Performance: </w:t>
       </w:r>
       <w:r>
         <w:rPr>
-          <w:rFonts w:ascii="Calibri" w:hAnsi="Calibri"/>
           <w:color w:val="4B5563"/>
-          <w:sz w:val="22"/>
         </w:rPr>
         <w:t>100 / 100 score on Google Lighthouse Performance audit.</w:t>
       </w:r>
     </w:p>
     <w:p>
       <w:pPr>
-        <w:pStyle w:val="ListParagraph"/>
         <w:spacing w:after="80"/>
         <w:ind w:left="360"/>
       </w:pPr>
       <w:r>
         <w:rPr>
+          <w:b/>
           <w:color w:val="2563EB"/>
-          <w:b/>
         </w:rPr>
         <w:t xml:space="preserve">•  </w:t>
       </w:r>
@@ -1835,29 +2863,25 @@
         <w:rPr>
           <w:b/>
           <w:color w:val="1F2937"/>
-          <w:sz w:val="22"/>
         </w:rPr>
         <w:t xml:space="preserve">Lighthouse Compliance: </w:t>
       </w:r>
       <w:r>
         <w:rPr>
-          <w:rFonts w:ascii="Calibri" w:hAnsi="Calibri"/>
           <w:color w:val="4B5563"/>
-          <w:sz w:val="22"/>
         </w:rPr>
         <w:t>100 / 100 score on Lighthouse Accessibility &amp; Best Practices.</w:t>
       </w:r>
     </w:p>
     <w:p>
       <w:pPr>
-        <w:pStyle w:val="ListParagraph"/>
         <w:spacing w:after="80"/>
         <w:ind w:left="360"/>
       </w:pPr>
       <w:r>
         <w:rPr>
+          <w:b/>
           <w:color w:val="2563EB"/>
-          <w:b/>
         </w:rPr>
         <w:t xml:space="preserve">•  </w:t>
       </w:r>
@@ -1865,29 +2889,25 @@
         <w:rPr>
           <w:b/>
           <w:color w:val="1F2937"/>
-          <w:sz w:val="22"/>
         </w:rPr>
         <w:t xml:space="preserve">CLS Verification: </w:t>
       </w:r>
       <w:r>
         <w:rPr>
-          <w:rFonts w:ascii="Calibri" w:hAnsi="Calibri"/>
           <w:color w:val="4B5563"/>
-          <w:sz w:val="22"/>
         </w:rPr>
         <w:t>Zero Cumulative Layout Shift across all responsive breakpoints (375px, 768px, 1440px).</w:t>
       </w:r>
     </w:p>
     <w:p>
       <w:pPr>
-        <w:pStyle w:val="ListParagraph"/>
         <w:spacing w:after="80"/>
         <w:ind w:left="360"/>
       </w:pPr>
       <w:r>
         <w:rPr>
+          <w:b/>
           <w:color w:val="2563EB"/>
-          <w:b/>
         </w:rPr>
         <w:t xml:space="preserve">•  </w:t>
       </w:r>
@@ -1895,29 +2915,25 @@
         <w:rPr>
           <w:b/>
           <w:color w:val="1F2937"/>
-          <w:sz w:val="22"/>
         </w:rPr>
         <w:t xml:space="preserve">Main-Thread Efficiency: </w:t>
       </w:r>
       <w:r>
         <w:rPr>
-          <w:rFonts w:ascii="Calibri" w:hAnsi="Calibri"/>
           <w:color w:val="4B5563"/>
-          <w:sz w:val="22"/>
         </w:rPr>
         <w:t>Zero Long Tasks (&gt;50ms) detected during interactive page life-cycle.</w:t>
       </w:r>
     </w:p>
     <w:p>
       <w:pPr>
-        <w:pStyle w:val="ListParagraph"/>
         <w:spacing w:after="80"/>
         <w:ind w:left="360"/>
       </w:pPr>
       <w:r>
         <w:rPr>
+          <w:b/>
           <w:color w:val="2563EB"/>
-          <w:b/>
         </w:rPr>
         <w:t xml:space="preserve">•  </w:t>
       </w:r>
@@ -1925,15 +2941,12 @@
         <w:rPr>
           <w:b/>
           <w:color w:val="1F2937"/>
-          <w:sz w:val="22"/>
         </w:rPr>
         <w:t xml:space="preserve">Audit Reproducibility: </w:t>
       </w:r>
       <w:r>
         <w:rPr>
-          <w:rFonts w:ascii="Calibri" w:hAnsi="Calibri"/>
           <w:color w:val="4B5563"/>
-          <w:sz w:val="22"/>
         </w:rPr>
         <w:t>Dedicated baseline fixture in /before-optimization/ providing empirical contrast.</w:t>
       </w:r>
@@ -1941,22 +2954,732 @@
     <w:sectPr>
       <w:pgSz w:w="12240" w:h="15840"/>
       <w:pgMar w:top="1440" w:right="1440" w:bottom="1440" w:left="1440" w:header="720" w:footer="720" w:gutter="0"/>
+      <w:cols w:space="720"/>
     </w:sectPr>
   </w:body>
 </w:document>
 </file>
 
 <file path=word/styles.xml><?xml version="1.0" encoding="utf-8"?>
-<w:styles xmlns:w="http://schemas.openxmlformats.org/wordprocessingml/2006/main">
+<w:styles xmlns:mc="http://schemas.openxmlformats.org/markup-compatibility/2006" xmlns:r="http://schemas.openxmlformats.org/officeDocument/2006/relationships" xmlns:w="http://schemas.openxmlformats.org/wordprocessingml/2006/main" xmlns:w14="http://schemas.microsoft.com/office/word/2010/wordml" xmlns:w15="http://schemas.microsoft.com/office/word/2012/wordml" xmlns:w16cex="http://schemas.microsoft.com/office/word/2018/wordml/cex" xmlns:w16cid="http://schemas.microsoft.com/office/word/2016/wordml/cid" xmlns:w16="http://schemas.microsoft.com/office/word/2018/wordml" xmlns:w16du="http://schemas.microsoft.com/office/word/2023/wordml/word16du" xmlns:w16sdtdh="http://schemas.microsoft.com/office/word/2020/wordml/sdtdatahash" xmlns:w16sdtfl="http://schemas.microsoft.com/office/word/2024/wordml/sdtformatlock" xmlns:w16se="http://schemas.microsoft.com/office/word/2015/wordml/symex" mc:Ignorable="w14 w15 w16se w16cid w16 w16cex w16sdtdh w16sdtfl w16du">
   <w:docDefaults>
     <w:rPrDefault>
       <w:rPr>
-        <w:rFonts w:ascii="Calibri" w:hAnsi="Calibri" w:cs="Calibri"/>
+        <w:rFonts w:ascii="Calibri" w:eastAsia="Times New Roman" w:hAnsi="Calibri" w:cs="Calibri"/>
         <w:sz w:val="22"/>
         <w:szCs w:val="22"/>
-        <w:lang w:val="en-US"/>
+        <w:lang w:val="en-US" w:eastAsia="en-US" w:bidi="hi-IN"/>
       </w:rPr>
     </w:rPrDefault>
+    <w:pPrDefault>
+      <w:pPr>
+        <w:spacing w:after="160" w:line="278" w:lineRule="auto"/>
+      </w:pPr>
+    </w:pPrDefault>
   </w:docDefaults>
+  <w:latentStyles w:defLockedState="0" w:defUIPriority="99" w:defSemiHidden="0" w:defUnhideWhenUsed="0" w:defQFormat="0" w:count="376">
+    <w:lsdException w:name="Normal" w:uiPriority="0" w:qFormat="1"/>
+    <w:lsdException w:name="heading 1" w:uiPriority="9" w:qFormat="1"/>
+    <w:lsdException w:name="heading 2" w:semiHidden="1" w:uiPriority="9" w:unhideWhenUsed="1" w:qFormat="1"/>
+    <w:lsdException w:name="heading 3" w:semiHidden="1" w:uiPriority="9" w:unhideWhenUsed="1" w:qFormat="1"/>
+    <w:lsdException w:name="heading 4" w:semiHidden="1" w:uiPriority="9" w:unhideWhenUsed="1" w:qFormat="1"/>
+    <w:lsdException w:name="heading 5" w:semiHidden="1" w:uiPriority="9" w:unhideWhenUsed="1" w:qFormat="1"/>
+    <w:lsdException w:name="heading 6" w:semiHidden="1" w:uiPriority="9" w:unhideWhenUsed="1" w:qFormat="1"/>
+    <w:lsdException w:name="heading 7" w:semiHidden="1" w:uiPriority="9" w:unhideWhenUsed="1" w:qFormat="1"/>
+    <w:lsdException w:name="heading 8" w:semiHidden="1" w:uiPriority="9" w:unhideWhenUsed="1" w:qFormat="1"/>
+    <w:lsdException w:name="heading 9" w:semiHidden="1" w:uiPriority="9" w:unhideWhenUsed="1" w:qFormat="1"/>
+    <w:lsdException w:name="index 1" w:semiHidden="1" w:unhideWhenUsed="1"/>
+    <w:lsdException w:name="index 2" w:semiHidden="1" w:unhideWhenUsed="1"/>
+    <w:lsdException w:name="index 3" w:semiHidden="1" w:unhideWhenUsed="1"/>
+    <w:lsdException w:name="index 4" w:semiHidden="1" w:unhideWhenUsed="1"/>
+    <w:lsdException w:name="index 5" w:semiHidden="1" w:unhideWhenUsed="1"/>
+    <w:lsdException w:name="index 6" w:semiHidden="1" w:unhideWhenUsed="1"/>
+    <w:lsdException w:name="index 7" w:semiHidden="1" w:unhideWhenUsed="1"/>
+    <w:lsdException w:name="index 8" w:semiHidden="1" w:unhideWhenUsed="1"/>
+    <w:lsdException w:name="index 9" w:semiHidden="1" w:unhideWhenUsed="1"/>
+    <w:lsdException w:name="toc 1" w:semiHidden="1" w:uiPriority="39" w:unhideWhenUsed="1"/>
+    <w:lsdException w:name="toc 2" w:semiHidden="1" w:uiPriority="39" w:unhideWhenUsed="1"/>
+    <w:lsdException w:name="toc 3" w:semiHidden="1" w:uiPriority="39" w:unhideWhenUsed="1"/>
+    <w:lsdException w:name="toc 4" w:semiHidden="1" w:uiPriority="39" w:unhideWhenUsed="1"/>
+    <w:lsdException w:name="toc 5" w:semiHidden="1" w:uiPriority="39" w:unhideWhenUsed="1"/>
+    <w:lsdException w:name="toc 6" w:semiHidden="1" w:uiPriority="39" w:unhideWhenUsed="1"/>
+    <w:lsdException w:name="toc 7" w:semiHidden="1" w:uiPriority="39" w:unhideWhenUsed="1"/>
+    <w:lsdException w:name="toc 8" w:semiHidden="1" w:uiPriority="39" w:unhideWhenUsed="1"/>
+    <w:lsdException w:name="toc 9" w:semiHidden="1" w:uiPriority="39" w:unhideWhenUsed="1"/>
+    <w:lsdException w:name="Normal Indent" w:semiHidden="1" w:unhideWhenUsed="1"/>
+    <w:lsdException w:name="footnote text" w:semiHidden="1" w:unhideWhenUsed="1"/>
+    <w:lsdException w:name="annotation text" w:semiHidden="1" w:unhideWhenUsed="1"/>
+    <w:lsdException w:name="header" w:semiHidden="1" w:unhideWhenUsed="1"/>
+    <w:lsdException w:name="footer" w:semiHidden="1" w:unhideWhenUsed="1"/>
+    <w:lsdException w:name="index heading" w:semiHidden="1" w:unhideWhenUsed="1"/>
+    <w:lsdException w:name="caption" w:semiHidden="1" w:uiPriority="35" w:unhideWhenUsed="1" w:qFormat="1"/>
+    <w:lsdException w:name="table of figures" w:semiHidden="1" w:unhideWhenUsed="1"/>
+    <w:lsdException w:name="envelope address" w:semiHidden="1" w:unhideWhenUsed="1"/>
+    <w:lsdException w:name="envelope return" w:semiHidden="1" w:unhideWhenUsed="1"/>
+    <w:lsdException w:name="footnote reference" w:semiHidden="1" w:unhideWhenUsed="1"/>
+    <w:lsdException w:name="annotation reference" w:semiHidden="1" w:unhideWhenUsed="1"/>
+    <w:lsdException w:name="line number" w:semiHidden="1" w:unhideWhenUsed="1"/>
+    <w:lsdException w:name="page number" w:semiHidden="1" w:unhideWhenUsed="1"/>
+    <w:lsdException w:name="endnote reference" w:semiHidden="1" w:unhideWhenUsed="1"/>
+    <w:lsdException w:name="endnote text" w:semiHidden="1" w:unhideWhenUsed="1"/>
+    <w:lsdException w:name="table of authorities" w:semiHidden="1" w:unhideWhenUsed="1"/>
+    <w:lsdException w:name="macro" w:semiHidden="1" w:unhideWhenUsed="1"/>
+    <w:lsdException w:name="toa heading" w:semiHidden="1" w:unhideWhenUsed="1"/>
+    <w:lsdException w:name="List" w:semiHidden="1" w:unhideWhenUsed="1"/>
+    <w:lsdException w:name="List Bullet" w:semiHidden="1" w:unhideWhenUsed="1"/>
+    <w:lsdException w:name="List Number" w:semiHidden="1" w:unhideWhenUsed="1"/>
+    <w:lsdException w:name="List 2" w:semiHidden="1" w:unhideWhenUsed="1"/>
+    <w:lsdException w:name="List 3" w:semiHidden="1" w:unhideWhenUsed="1"/>
+    <w:lsdException w:name="List 4" w:semiHidden="1" w:unhideWhenUsed="1"/>
+    <w:lsdException w:name="List 5" w:semiHidden="1" w:unhideWhenUsed="1"/>
+    <w:lsdException w:name="List Bullet 2" w:semiHidden="1" w:unhideWhenUsed="1"/>
+    <w:lsdException w:name="List Bullet 3" w:semiHidden="1" w:unhideWhenUsed="1"/>
+    <w:lsdException w:name="List Bullet 4" w:semiHidden="1" w:unhideWhenUsed="1"/>
+    <w:lsdException w:name="List Bullet 5" w:semiHidden="1" w:unhideWhenUsed="1"/>
+    <w:lsdException w:name="List Number 2" w:semiHidden="1" w:unhideWhenUsed="1"/>
+    <w:lsdException w:name="List Number 3" w:semiHidden="1" w:unhideWhenUsed="1"/>
+    <w:lsdException w:name="List Number 4" w:semiHidden="1" w:unhideWhenUsed="1"/>
+    <w:lsdException w:name="List Number 5" w:semiHidden="1" w:unhideWhenUsed="1"/>
+    <w:lsdException w:name="Title" w:uiPriority="10" w:qFormat="1"/>
+    <w:lsdException w:name="Closing" w:semiHidden="1" w:unhideWhenUsed="1"/>
+    <w:lsdException w:name="Signature" w:semiHidden="1" w:unhideWhenUsed="1"/>
+    <w:lsdException w:name="Default Paragraph Font" w:semiHidden="1" w:uiPriority="1" w:unhideWhenUsed="1"/>
+    <w:lsdException w:name="Body Text" w:semiHidden="1" w:unhideWhenUsed="1"/>
+    <w:lsdException w:name="Body Text Indent" w:semiHidden="1" w:unhideWhenUsed="1"/>
+    <w:lsdException w:name="List Continue" w:semiHidden="1" w:unhideWhenUsed="1"/>
+    <w:lsdException w:name="List Continue 2" w:semiHidden="1" w:unhideWhenUsed="1"/>
+    <w:lsdException w:name="List Continue 3" w:semiHidden="1" w:unhideWhenUsed="1"/>
+    <w:lsdException w:name="List Continue 4" w:semiHidden="1" w:unhideWhenUsed="1"/>
+    <w:lsdException w:name="List Continue 5" w:semiHidden="1" w:unhideWhenUsed="1"/>
+    <w:lsdException w:name="Message Header" w:semiHidden="1" w:unhideWhenUsed="1"/>
+    <w:lsdException w:name="Subtitle" w:uiPriority="11" w:qFormat="1"/>
+    <w:lsdException w:name="Salutation" w:semiHidden="1" w:unhideWhenUsed="1"/>
+    <w:lsdException w:name="Date" w:semiHidden="1" w:unhideWhenUsed="1"/>
+    <w:lsdException w:name="Body Text First Indent" w:semiHidden="1" w:unhideWhenUsed="1"/>
+    <w:lsdException w:name="Body Text First Indent 2" w:semiHidden="1" w:unhideWhenUsed="1"/>
+    <w:lsdException w:name="Note Heading" w:semiHidden="1" w:unhideWhenUsed="1"/>
+    <w:lsdException w:name="Body Text 2" w:semiHidden="1" w:unhideWhenUsed="1"/>
+    <w:lsdException w:name="Body Text 3" w:semiHidden="1" w:unhideWhenUsed="1"/>
+    <w:lsdException w:name="Body Text Indent 2" w:semiHidden="1" w:unhideWhenUsed="1"/>
+    <w:lsdException w:name="Body Text Indent 3" w:semiHidden="1" w:unhideWhenUsed="1"/>
+    <w:lsdException w:name="Block Text" w:semiHidden="1" w:unhideWhenUsed="1"/>
+    <w:lsdException w:name="Hyperlink" w:semiHidden="1" w:unhideWhenUsed="1"/>
+    <w:lsdException w:name="FollowedHyperlink" w:semiHidden="1" w:unhideWhenUsed="1"/>
+    <w:lsdException w:name="Strong" w:uiPriority="22" w:qFormat="1"/>
+    <w:lsdException w:name="Emphasis" w:uiPriority="20" w:qFormat="1"/>
+    <w:lsdException w:name="Document Map" w:semiHidden="1" w:unhideWhenUsed="1"/>
+    <w:lsdException w:name="Plain Text" w:semiHidden="1" w:unhideWhenUsed="1"/>
+    <w:lsdException w:name="E-mail Signature" w:semiHidden="1" w:unhideWhenUsed="1"/>
+    <w:lsdException w:name="HTML Top of Form" w:semiHidden="1" w:unhideWhenUsed="1"/>
+    <w:lsdException w:name="HTML Bottom of Form" w:semiHidden="1" w:unhideWhenUsed="1"/>
+    <w:lsdException w:name="Normal (Web)" w:semiHidden="1" w:unhideWhenUsed="1"/>
+    <w:lsdException w:name="HTML Acronym" w:semiHidden="1" w:unhideWhenUsed="1"/>
+    <w:lsdException w:name="HTML Address" w:semiHidden="1" w:unhideWhenUsed="1"/>
+    <w:lsdException w:name="HTML Cite" w:semiHidden="1" w:unhideWhenUsed="1"/>
+    <w:lsdException w:name="HTML Code" w:semiHidden="1" w:unhideWhenUsed="1"/>
+    <w:lsdException w:name="HTML Definition" w:semiHidden="1" w:unhideWhenUsed="1"/>
+    <w:lsdException w:name="HTML Keyboard" w:semiHidden="1" w:unhideWhenUsed="1"/>
+    <w:lsdException w:name="HTML Preformatted" w:semiHidden="1" w:unhideWhenUsed="1"/>
+    <w:lsdException w:name="HTML Sample" w:semiHidden="1" w:unhideWhenUsed="1"/>
+    <w:lsdException w:name="HTML Typewriter" w:semiHidden="1" w:unhideWhenUsed="1"/>
+    <w:lsdException w:name="HTML Variable" w:semiHidden="1" w:unhideWhenUsed="1"/>
+    <w:lsdException w:name="Normal Table" w:semiHidden="1" w:unhideWhenUsed="1"/>
+    <w:lsdException w:name="annotation subject" w:semiHidden="1" w:unhideWhenUsed="1"/>
+    <w:lsdException w:name="No List" w:semiHidden="1" w:unhideWhenUsed="1"/>
+    <w:lsdException w:name="Outline List 1" w:semiHidden="1" w:unhideWhenUsed="1"/>
+    <w:lsdException w:name="Outline List 2" w:semiHidden="1" w:unhideWhenUsed="1"/>
+    <w:lsdException w:name="Outline List 3" w:semiHidden="1" w:unhideWhenUsed="1"/>
+    <w:lsdException w:name="Table Simple 1" w:semiHidden="1" w:unhideWhenUsed="1"/>
+    <w:lsdException w:name="Table Simple 2" w:semiHidden="1" w:unhideWhenUsed="1"/>
+    <w:lsdException w:name="Table Simple 3" w:semiHidden="1" w:unhideWhenUsed="1"/>
+    <w:lsdException w:name="Table Classic 1" w:semiHidden="1" w:unhideWhenUsed="1"/>
+    <w:lsdException w:name="Table Classic 2" w:semiHidden="1" w:unhideWhenUsed="1"/>
+    <w:lsdException w:name="Table Classic 3" w:semiHidden="1" w:unhideWhenUsed="1"/>
+    <w:lsdException w:name="Table Classic 4" w:semiHidden="1" w:unhideWhenUsed="1"/>
+    <w:lsdException w:name="Table Colorful 1" w:semiHidden="1" w:unhideWhenUsed="1"/>
+    <w:lsdException w:name="Table Colorful 2" w:semiHidden="1" w:unhideWhenUsed="1"/>
+    <w:lsdException w:name="Table Colorful 3" w:semiHidden="1" w:unhideWhenUsed="1"/>
+    <w:lsdException w:name="Table Columns 1" w:semiHidden="1" w:unhideWhenUsed="1"/>
+    <w:lsdException w:name="Table Columns 2" w:semiHidden="1" w:unhideWhenUsed="1"/>
+    <w:lsdException w:name="Table Columns 3" w:semiHidden="1" w:unhideWhenUsed="1"/>
+    <w:lsdException w:name="Table Columns 4" w:semiHidden="1" w:unhideWhenUsed="1"/>
+    <w:lsdException w:name="Table Columns 5" w:semiHidden="1" w:unhideWhenUsed="1"/>
+    <w:lsdException w:name="Table Grid 1" w:semiHidden="1" w:unhideWhenUsed="1"/>
+    <w:lsdException w:name="Table Grid 2" w:semiHidden="1" w:unhideWhenUsed="1"/>
+    <w:lsdException w:name="Table Grid 3" w:semiHidden="1" w:unhideWhenUsed="1"/>
+    <w:lsdException w:name="Table Grid 4" w:semiHidden="1" w:unhideWhenUsed="1"/>
+    <w:lsdException w:name="Table Grid 5" w:semiHidden="1" w:unhideWhenUsed="1"/>
+    <w:lsdException w:name="Table Grid 6" w:semiHidden="1" w:unhideWhenUsed="1"/>
+    <w:lsdException w:name="Table Grid 7" w:semiHidden="1" w:unhideWhenUsed="1"/>
+    <w:lsdException w:name="Table Grid 8" w:semiHidden="1" w:unhideWhenUsed="1"/>
+    <w:lsdException w:name="Table List 1" w:semiHidden="1" w:unhideWhenUsed="1"/>
+    <w:lsdException w:name="Table List 2" w:semiHidden="1" w:unhideWhenUsed="1"/>
+    <w:lsdException w:name="Table List 3" w:semiHidden="1" w:unhideWhenUsed="1"/>
+    <w:lsdException w:name="Table List 4" w:semiHidden="1" w:unhideWhenUsed="1"/>
+    <w:lsdException w:name="Table List 5" w:semiHidden="1" w:unhideWhenUsed="1"/>
+    <w:lsdException w:name="Table List 6" w:semiHidden="1" w:unhideWhenUsed="1"/>
+    <w:lsdException w:name="Table List 7" w:semiHidden="1" w:unhideWhenUsed="1"/>
+    <w:lsdException w:name="Table List 8" w:semiHidden="1" w:unhideWhenUsed="1"/>
+    <w:lsdException w:name="Table 3D effects 1" w:semiHidden="1" w:unhideWhenUsed="1"/>
+    <w:lsdException w:name="Table 3D effects 2" w:semiHidden="1" w:unhideWhenUsed="1"/>
+    <w:lsdException w:name="Table 3D effects 3" w:semiHidden="1" w:unhideWhenUsed="1"/>
+    <w:lsdException w:name="Table Contemporary" w:semiHidden="1" w:unhideWhenUsed="1"/>
+    <w:lsdException w:name="Table Elegant" w:semiHidden="1" w:unhideWhenUsed="1"/>
+    <w:lsdException w:name="Table Professional" w:semiHidden="1" w:unhideWhenUsed="1"/>
+    <w:lsdException w:name="Table Subtle 1" w:semiHidden="1" w:unhideWhenUsed="1"/>
+    <w:lsdException w:name="Table Subtle 2" w:semiHidden="1" w:unhideWhenUsed="1"/>
+    <w:lsdException w:name="Table Web 1" w:semiHidden="1" w:unhideWhenUsed="1"/>
+    <w:lsdException w:name="Table Web 2" w:semiHidden="1" w:unhideWhenUsed="1"/>
+    <w:lsdException w:name="Table Web 3" w:semiHidden="1" w:unhideWhenUsed="1"/>
+    <w:lsdException w:name="Balloon Text" w:semiHidden="1" w:unhideWhenUsed="1"/>
+    <w:lsdException w:name="Table Grid" w:uiPriority="39"/>
+    <w:lsdException w:name="Table Theme" w:semiHidden="1" w:unhideWhenUsed="1"/>
+    <w:lsdException w:name="Placeholder Text" w:semiHidden="1"/>
+    <w:lsdException w:name="No Spacing" w:uiPriority="1" w:qFormat="1"/>
+    <w:lsdException w:name="Light Shading" w:uiPriority="60"/>
+    <w:lsdException w:name="Light List" w:uiPriority="61"/>
+    <w:lsdException w:name="Light Grid" w:uiPriority="62"/>
+    <w:lsdException w:name="Medium Shading 1" w:uiPriority="63"/>
+    <w:lsdException w:name="Medium Shading 2" w:uiPriority="64"/>
+    <w:lsdException w:name="Medium List 1" w:uiPriority="65"/>
+    <w:lsdException w:name="Medium List 2" w:uiPriority="66"/>
+    <w:lsdException w:name="Medium Grid 1" w:uiPriority="67"/>
+    <w:lsdException w:name="Medium Grid 2" w:uiPriority="68"/>
+    <w:lsdException w:name="Medium Grid 3" w:uiPriority="69"/>
+    <w:lsdException w:name="Dark List" w:uiPriority="70"/>
+    <w:lsdException w:name="Colorful Shading" w:uiPriority="71"/>
+    <w:lsdException w:name="Colorful List" w:uiPriority="72"/>
+    <w:lsdException w:name="Colorful Grid" w:uiPriority="73"/>
+    <w:lsdException w:name="Light Shading Accent 1" w:uiPriority="60"/>
+    <w:lsdException w:name="Light List Accent 1" w:uiPriority="61"/>
+    <w:lsdException w:name="Light Grid Accent 1" w:uiPriority="62"/>
+    <w:lsdException w:name="Medium Shading 1 Accent 1" w:uiPriority="63"/>
+    <w:lsdException w:name="Medium Shading 2 Accent 1" w:uiPriority="64"/>
+    <w:lsdException w:name="Medium List 1 Accent 1" w:uiPriority="65"/>
+    <w:lsdException w:name="Revision" w:semiHidden="1"/>
+    <w:lsdException w:name="List Paragraph" w:uiPriority="34" w:qFormat="1"/>
+    <w:lsdException w:name="Quote" w:uiPriority="29" w:qFormat="1"/>
+    <w:lsdException w:name="Intense Quote" w:uiPriority="30" w:qFormat="1"/>
+    <w:lsdException w:name="Medium List 2 Accent 1" w:uiPriority="66"/>
+    <w:lsdException w:name="Medium Grid 1 Accent 1" w:uiPriority="67"/>
+    <w:lsdException w:name="Medium Grid 2 Accent 1" w:uiPriority="68"/>
+    <w:lsdException w:name="Medium Grid 3 Accent 1" w:uiPriority="69"/>
+    <w:lsdException w:name="Dark List Accent 1" w:uiPriority="70"/>
+    <w:lsdException w:name="Colorful Shading Accent 1" w:uiPriority="71"/>
+    <w:lsdException w:name="Colorful List Accent 1" w:uiPriority="72"/>
+    <w:lsdException w:name="Colorful Grid Accent 1" w:uiPriority="73"/>
+    <w:lsdException w:name="Light Shading Accent 2" w:uiPriority="60"/>
+    <w:lsdException w:name="Light List Accent 2" w:uiPriority="61"/>
+    <w:lsdException w:name="Light Grid Accent 2" w:uiPriority="62"/>
+    <w:lsdException w:name="Medium Shading 1 Accent 2" w:uiPriority="63"/>
+    <w:lsdException w:name="Medium Shading 2 Accent 2" w:uiPriority="64"/>
+    <w:lsdException w:name="Medium List 1 Accent 2" w:uiPriority="65"/>
+    <w:lsdException w:name="Medium List 2 Accent 2" w:uiPriority="66"/>
+    <w:lsdException w:name="Medium Grid 1 Accent 2" w:uiPriority="67"/>
+    <w:lsdException w:name="Medium Grid 2 Accent 2" w:uiPriority="68"/>
+    <w:lsdException w:name="Medium Grid 3 Accent 2" w:uiPriority="69"/>
+    <w:lsdException w:name="Dark List Accent 2" w:uiPriority="70"/>
+    <w:lsdException w:name="Colorful Shading Accent 2" w:uiPriority="71"/>
+    <w:lsdException w:name="Colorful List Accent 2" w:uiPriority="72"/>
+    <w:lsdException w:name="Colorful Grid Accent 2" w:uiPriority="73"/>
+    <w:lsdException w:name="Light Shading Accent 3" w:uiPriority="60"/>
+    <w:lsdException w:name="Light List Accent 3" w:uiPriority="61"/>
+    <w:lsdException w:name="Light Grid Accent 3" w:uiPriority="62"/>
+    <w:lsdException w:name="Medium Shading 1 Accent 3" w:uiPriority="63"/>
+    <w:lsdException w:name="Medium Shading 2 Accent 3" w:uiPriority="64"/>
+    <w:lsdException w:name="Medium List 1 Accent 3" w:uiPriority="65"/>
+    <w:lsdException w:name="Medium List 2 Accent 3" w:uiPriority="66"/>
+    <w:lsdException w:name="Medium Grid 1 Accent 3" w:uiPriority="67"/>
+    <w:lsdException w:name="Medium Grid 2 Accent 3" w:uiPriority="68"/>
+    <w:lsdException w:name="Medium Grid 3 Accent 3" w:uiPriority="69"/>
+    <w:lsdException w:name="Dark List Accent 3" w:uiPriority="70"/>
+    <w:lsdException w:name="Colorful Shading Accent 3" w:uiPriority="71"/>
+    <w:lsdException w:name="Colorful List Accent 3" w:uiPriority="72"/>
+    <w:lsdException w:name="Colorful Grid Accent 3" w:uiPriority="73"/>
+    <w:lsdException w:name="Light Shading Accent 4" w:uiPriority="60"/>
+    <w:lsdException w:name="Light List Accent 4" w:uiPriority="61"/>
+    <w:lsdException w:name="Light Grid Accent 4" w:uiPriority="62"/>
+    <w:lsdException w:name="Medium Shading 1 Accent 4" w:uiPriority="63"/>
+    <w:lsdException w:name="Medium Shading 2 Accent 4" w:uiPriority="64"/>
+    <w:lsdException w:name="Medium List 1 Accent 4" w:uiPriority="65"/>
+    <w:lsdException w:name="Medium List 2 Accent 4" w:uiPriority="66"/>
+    <w:lsdException w:name="Medium Grid 1 Accent 4" w:uiPriority="67"/>
+    <w:lsdException w:name="Medium Grid 2 Accent 4" w:uiPriority="68"/>
+    <w:lsdException w:name="Medium Grid 3 Accent 4" w:uiPriority="69"/>
+    <w:lsdException w:name="Dark List Accent 4" w:uiPriority="70"/>
+    <w:lsdException w:name="Colorful Shading Accent 4" w:uiPriority="71"/>
+    <w:lsdException w:name="Colorful List Accent 4" w:uiPriority="72"/>
+    <w:lsdException w:name="Colorful Grid Accent 4" w:uiPriority="73"/>
+    <w:lsdException w:name="Light Shading Accent 5" w:uiPriority="60"/>
+    <w:lsdException w:name="Light List Accent 5" w:uiPriority="61"/>
+    <w:lsdException w:name="Light Grid Accent 5" w:uiPriority="62"/>
+    <w:lsdException w:name="Medium Shading 1 Accent 5" w:uiPriority="63"/>
+    <w:lsdException w:name="Medium Shading 2 Accent 5" w:uiPriority="64"/>
+    <w:lsdException w:name="Medium List 1 Accent 5" w:uiPriority="65"/>
+    <w:lsdException w:name="Medium List 2 Accent 5" w:uiPriority="66"/>
+    <w:lsdException w:name="Medium Grid 1 Accent 5" w:uiPriority="67"/>
+    <w:lsdException w:name="Medium Grid 2 Accent 5" w:uiPriority="68"/>
+    <w:lsdException w:name="Medium Grid 3 Accent 5" w:uiPriority="69"/>
+    <w:lsdException w:name="Dark List Accent 5" w:uiPriority="70"/>
+    <w:lsdException w:name="Colorful Shading Accent 5" w:uiPriority="71"/>
+    <w:lsdException w:name="Colorful List Accent 5" w:uiPriority="72"/>
+    <w:lsdException w:name="Colorful Grid Accent 5" w:uiPriority="73"/>
+    <w:lsdException w:name="Light Shading Accent 6" w:uiPriority="60"/>
+    <w:lsdException w:name="Light List Accent 6" w:uiPriority="61"/>
+    <w:lsdException w:name="Light Grid Accent 6" w:uiPriority="62"/>
+    <w:lsdException w:name="Medium Shading 1 Accent 6" w:uiPriority="63"/>
+    <w:lsdException w:name="Medium Shading 2 Accent 6" w:uiPriority="64"/>
+    <w:lsdException w:name="Medium List 1 Accent 6" w:uiPriority="65"/>
+    <w:lsdException w:name="Medium List 2 Accent 6" w:uiPriority="66"/>
+    <w:lsdException w:name="Medium Grid 1 Accent 6" w:uiPriority="67"/>
+    <w:lsdException w:name="Medium Grid 2 Accent 6" w:uiPriority="68"/>
+    <w:lsdException w:name="Medium Grid 3 Accent 6" w:uiPriority="69"/>
+    <w:lsdException w:name="Dark List Accent 6" w:uiPriority="70"/>
+    <w:lsdException w:name="Colorful Shading Accent 6" w:uiPriority="71"/>
+    <w:lsdException w:name="Colorful List Accent 6" w:uiPriority="72"/>
+    <w:lsdException w:name="Colorful Grid Accent 6" w:uiPriority="73"/>
+    <w:lsdException w:name="Subtle Emphasis" w:uiPriority="19" w:qFormat="1"/>
+    <w:lsdException w:name="Intense Emphasis" w:uiPriority="21" w:qFormat="1"/>
+    <w:lsdException w:name="Subtle Reference" w:uiPriority="31" w:qFormat="1"/>
+    <w:lsdException w:name="Intense Reference" w:uiPriority="32" w:qFormat="1"/>
+    <w:lsdException w:name="Book Title" w:uiPriority="33" w:qFormat="1"/>
+    <w:lsdException w:name="Bibliography" w:semiHidden="1" w:uiPriority="37" w:unhideWhenUsed="1"/>
+    <w:lsdException w:name="TOC Heading" w:semiHidden="1" w:uiPriority="39" w:unhideWhenUsed="1" w:qFormat="1"/>
+    <w:lsdException w:name="Plain Table 1" w:uiPriority="41"/>
+    <w:lsdException w:name="Plain Table 2" w:uiPriority="42"/>
+    <w:lsdException w:name="Plain Table 3" w:uiPriority="43"/>
+    <w:lsdException w:name="Plain Table 4" w:uiPriority="44"/>
+    <w:lsdException w:name="Plain Table 5" w:uiPriority="45"/>
+    <w:lsdException w:name="Grid Table Light" w:uiPriority="40"/>
+    <w:lsdException w:name="Grid Table 1 Light" w:uiPriority="46"/>
+    <w:lsdException w:name="Grid Table 2" w:uiPriority="47"/>
+    <w:lsdException w:name="Grid Table 3" w:uiPriority="48"/>
+    <w:lsdException w:name="Grid Table 4" w:uiPriority="49"/>
+    <w:lsdException w:name="Grid Table 5 Dark" w:uiPriority="50"/>
+    <w:lsdException w:name="Grid Table 6 Colorful" w:uiPriority="51"/>
+    <w:lsdException w:name="Grid Table 7 Colorful" w:uiPriority="52"/>
+    <w:lsdException w:name="Grid Table 1 Light Accent 1" w:uiPriority="46"/>
+    <w:lsdException w:name="Grid Table 2 Accent 1" w:uiPriority="47"/>
+    <w:lsdException w:name="Grid Table 3 Accent 1" w:uiPriority="48"/>
+    <w:lsdException w:name="Grid Table 4 Accent 1" w:uiPriority="49"/>
+    <w:lsdException w:name="Grid Table 5 Dark Accent 1" w:uiPriority="50"/>
+    <w:lsdException w:name="Grid Table 6 Colorful Accent 1" w:uiPriority="51"/>
+    <w:lsdException w:name="Grid Table 7 Colorful Accent 1" w:uiPriority="52"/>
+    <w:lsdException w:name="Grid Table 1 Light Accent 2" w:uiPriority="46"/>
+    <w:lsdException w:name="Grid Table 2 Accent 2" w:uiPriority="47"/>
+    <w:lsdException w:name="Grid Table 3 Accent 2" w:uiPriority="48"/>
+    <w:lsdException w:name="Grid Table 4 Accent 2" w:uiPriority="49"/>
+    <w:lsdException w:name="Grid Table 5 Dark Accent 2" w:uiPriority="50"/>
+    <w:lsdException w:name="Grid Table 6 Colorful Accent 2" w:uiPriority="51"/>
+    <w:lsdException w:name="Grid Table 7 Colorful Accent 2" w:uiPriority="52"/>
+    <w:lsdException w:name="Grid Table 1 Light Accent 3" w:uiPriority="46"/>
+    <w:lsdException w:name="Grid Table 2 Accent 3" w:uiPriority="47"/>
+    <w:lsdException w:name="Grid Table 3 Accent 3" w:uiPriority="48"/>
+    <w:lsdException w:name="Grid Table 4 Accent 3" w:uiPriority="49"/>
+    <w:lsdException w:name="Grid Table 5 Dark Accent 3" w:uiPriority="50"/>
+    <w:lsdException w:name="Grid Table 6 Colorful Accent 3" w:uiPriority="51"/>
+    <w:lsdException w:name="Grid Table 7 Colorful Accent 3" w:uiPriority="52"/>
+    <w:lsdException w:name="Grid Table 1 Light Accent 4" w:uiPriority="46"/>
+    <w:lsdException w:name="Grid Table 2 Accent 4" w:uiPriority="47"/>
+    <w:lsdException w:name="Grid Table 3 Accent 4" w:uiPriority="48"/>
+    <w:lsdException w:name="Grid Table 4 Accent 4" w:uiPriority="49"/>
+    <w:lsdException w:name="Grid Table 5 Dark Accent 4" w:uiPriority="50"/>
+    <w:lsdException w:name="Grid Table 6 Colorful Accent 4" w:uiPriority="51"/>
+    <w:lsdException w:name="Grid Table 7 Colorful Accent 4" w:uiPriority="52"/>
+    <w:lsdException w:name="Grid Table 1 Light Accent 5" w:uiPriority="46"/>
+    <w:lsdException w:name="Grid Table 2 Accent 5" w:uiPriority="47"/>
+    <w:lsdException w:name="Grid Table 3 Accent 5" w:uiPriority="48"/>
+    <w:lsdException w:name="Grid Table 4 Accent 5" w:uiPriority="49"/>
+    <w:lsdException w:name="Grid Table 5 Dark Accent 5" w:uiPriority="50"/>
+    <w:lsdException w:name="Grid Table 6 Colorful Accent 5" w:uiPriority="51"/>
+    <w:lsdException w:name="Grid Table 7 Colorful Accent 5" w:uiPriority="52"/>
+    <w:lsdException w:name="Grid Table 1 Light Accent 6" w:uiPriority="46"/>
+    <w:lsdException w:name="Grid Table 2 Accent 6" w:uiPriority="47"/>
+    <w:lsdException w:name="Grid Table 3 Accent 6" w:uiPriority="48"/>
+    <w:lsdException w:name="Grid Table 4 Accent 6" w:uiPriority="49"/>
+    <w:lsdException w:name="Grid Table 5 Dark Accent 6" w:uiPriority="50"/>
+    <w:lsdException w:name="Grid Table 6 Colorful Accent 6" w:uiPriority="51"/>
+    <w:lsdException w:name="Grid Table 7 Colorful Accent 6" w:uiPriority="52"/>
+    <w:lsdException w:name="List Table 1 Light" w:uiPriority="46"/>
+    <w:lsdException w:name="List Table 2" w:uiPriority="47"/>
+    <w:lsdException w:name="List Table 3" w:uiPriority="48"/>
+    <w:lsdException w:name="List Table 4" w:uiPriority="49"/>
+    <w:lsdException w:name="List Table 5 Dark" w:uiPriority="50"/>
+    <w:lsdException w:name="List Table 6 Colorful" w:uiPriority="51"/>
+    <w:lsdException w:name="List Table 7 Colorful" w:uiPriority="52"/>
+    <w:lsdException w:name="List Table 1 Light Accent 1" w:uiPriority="46"/>
+    <w:lsdException w:name="List Table 2 Accent 1" w:uiPriority="47"/>
+    <w:lsdException w:name="List Table 3 Accent 1" w:uiPriority="48"/>
+    <w:lsdException w:name="List Table 4 Accent 1" w:uiPriority="49"/>
+    <w:lsdException w:name="List Table 5 Dark Accent 1" w:uiPriority="50"/>
+    <w:lsdException w:name="List Table 6 Colorful Accent 1" w:uiPriority="51"/>
+    <w:lsdException w:name="List Table 7 Colorful Accent 1" w:uiPriority="52"/>
+    <w:lsdException w:name="List Table 1 Light Accent 2" w:uiPriority="46"/>
+    <w:lsdException w:name="List Table 2 Accent 2" w:uiPriority="47"/>
+    <w:lsdException w:name="List Table 3 Accent 2" w:uiPriority="48"/>
+    <w:lsdException w:name="List Table 4 Accent 2" w:uiPriority="49"/>
+    <w:lsdException w:name="List Table 5 Dark Accent 2" w:uiPriority="50"/>
+    <w:lsdException w:name="List Table 6 Colorful Accent 2" w:uiPriority="51"/>
+    <w:lsdException w:name="List Table 7 Colorful Accent 2" w:uiPriority="52"/>
+    <w:lsdException w:name="List Table 1 Light Accent 3" w:uiPriority="46"/>
+    <w:lsdException w:name="List Table 2 Accent 3" w:uiPriority="47"/>
+    <w:lsdException w:name="List Table 3 Accent 3" w:uiPriority="48"/>
+    <w:lsdException w:name="List Table 4 Accent 3" w:uiPriority="49"/>
+    <w:lsdException w:name="List Table 5 Dark Accent 3" w:uiPriority="50"/>
+    <w:lsdException w:name="List Table 6 Colorful Accent 3" w:uiPriority="51"/>
+    <w:lsdException w:name="List Table 7 Colorful Accent 3" w:uiPriority="52"/>
+    <w:lsdException w:name="List Table 1 Light Accent 4" w:uiPriority="46"/>
+    <w:lsdException w:name="List Table 2 Accent 4" w:uiPriority="47"/>
+    <w:lsdException w:name="List Table 3 Accent 4" w:uiPriority="48"/>
+    <w:lsdException w:name="List Table 4 Accent 4" w:uiPriority="49"/>
+    <w:lsdException w:name="List Table 5 Dark Accent 4" w:uiPriority="50"/>
+    <w:lsdException w:name="List Table 6 Colorful Accent 4" w:uiPriority="51"/>
+    <w:lsdException w:name="List Table 7 Colorful Accent 4" w:uiPriority="52"/>
+    <w:lsdException w:name="List Table 1 Light Accent 5" w:uiPriority="46"/>
+    <w:lsdException w:name="List Table 2 Accent 5" w:uiPriority="47"/>
+    <w:lsdException w:name="List Table 3 Accent 5" w:uiPriority="48"/>
+    <w:lsdException w:name="List Table 4 Accent 5" w:uiPriority="49"/>
+    <w:lsdException w:name="List Table 5 Dark Accent 5" w:uiPriority="50"/>
+    <w:lsdException w:name="List Table 6 Colorful Accent 5" w:uiPriority="51"/>
+    <w:lsdException w:name="List Table 7 Colorful Accent 5" w:uiPriority="52"/>
+    <w:lsdException w:name="List Table 1 Light Accent 6" w:uiPriority="46"/>
+    <w:lsdException w:name="List Table 2 Accent 6" w:uiPriority="47"/>
+    <w:lsdException w:name="List Table 3 Accent 6" w:uiPriority="48"/>
+    <w:lsdException w:name="List Table 4 Accent 6" w:uiPriority="49"/>
+    <w:lsdException w:name="List Table 5 Dark Accent 6" w:uiPriority="50"/>
+    <w:lsdException w:name="List Table 6 Colorful Accent 6" w:uiPriority="51"/>
+    <w:lsdException w:name="List Table 7 Colorful Accent 6" w:uiPriority="52"/>
+    <w:lsdException w:name="Mention" w:semiHidden="1" w:unhideWhenUsed="1"/>
+    <w:lsdException w:name="Smart Hyperlink" w:semiHidden="1" w:unhideWhenUsed="1"/>
+    <w:lsdException w:name="Hashtag" w:semiHidden="1" w:unhideWhenUsed="1"/>
+    <w:lsdException w:name="Unresolved Mention" w:semiHidden="1" w:unhideWhenUsed="1"/>
+    <w:lsdException w:name="Smart Link" w:semiHidden="1" w:unhideWhenUsed="1"/>
+  </w:latentStyles>
+  <w:style w:type="paragraph" w:default="1" w:styleId="Normal">
+    <w:name w:val="Normal"/>
+    <w:qFormat/>
+  </w:style>
+  <w:style w:type="character" w:default="1" w:styleId="DefaultParagraphFont">
+    <w:name w:val="Default Paragraph Font"/>
+    <w:uiPriority w:val="1"/>
+    <w:semiHidden/>
+    <w:unhideWhenUsed/>
+  </w:style>
+  <w:style w:type="table" w:default="1" w:styleId="TableNormal">
+    <w:name w:val="Normal Table"/>
+    <w:uiPriority w:val="99"/>
+    <w:semiHidden/>
+    <w:unhideWhenUsed/>
+    <w:tblPr>
+      <w:tblInd w:w="0" w:type="dxa"/>
+      <w:tblCellMar>
+        <w:top w:w="0" w:type="dxa"/>
+        <w:left w:w="108" w:type="dxa"/>
+        <w:bottom w:w="0" w:type="dxa"/>
+        <w:right w:w="108" w:type="dxa"/>
+      </w:tblCellMar>
+    </w:tblPr>
+  </w:style>
+  <w:style w:type="numbering" w:default="1" w:styleId="NoList">
+    <w:name w:val="No List"/>
+    <w:uiPriority w:val="99"/>
+    <w:semiHidden/>
+    <w:unhideWhenUsed/>
+  </w:style>
 </w:styles>
+</file>
+
+<file path=word/theme/theme1.xml><?xml version="1.0" encoding="utf-8"?>
+<a:theme xmlns:a="http://schemas.openxmlformats.org/drawingml/2006/main" name="Office Theme">
+  <a:themeElements>
+    <a:clrScheme name="Office">
+      <a:dk1>
+        <a:sysClr val="windowText" lastClr="000000"/>
+      </a:dk1>
+      <a:lt1>
+        <a:sysClr val="window" lastClr="FFFFFF"/>
+      </a:lt1>
+      <a:dk2>
+        <a:srgbClr val="44546A"/>
+      </a:dk2>
+      <a:lt2>
+        <a:srgbClr val="E7E6E6"/>
+      </a:lt2>
+      <a:accent1>
+        <a:srgbClr val="4472C4"/>
+      </a:accent1>
+      <a:accent2>
+        <a:srgbClr val="ED7D31"/>
+      </a:accent2>
+      <a:accent3>
+        <a:srgbClr val="A5A5A5"/>
+      </a:accent3>
+      <a:accent4>
+        <a:srgbClr val="FFC000"/>
+      </a:accent4>
+      <a:accent5>
+        <a:srgbClr val="5B9BD5"/>
+      </a:accent5>
+      <a:accent6>
+        <a:srgbClr val="70AD47"/>
+      </a:accent6>
+      <a:hlink>
+        <a:srgbClr val="0563C1"/>
+      </a:hlink>
+      <a:folHlink>
+        <a:srgbClr val="954F72"/>
+      </a:folHlink>
+    </a:clrScheme>
+    <a:fontScheme name="Office">
+      <a:majorFont>
+        <a:latin typeface="Calibri Light" panose="020F0302020204030204"/>
+        <a:ea typeface=""/>
+        <a:cs typeface=""/>
+        <a:font script="Jpan" typeface="游ゴシック Light"/>
+        <a:font script="Hang" typeface="맑은 고딕"/>
+        <a:font script="Hans" typeface="等线 Light"/>
+        <a:font script="Hant" typeface="新細明體"/>
+        <a:font script="Arab" typeface="Times New Roman"/>
+        <a:font script="Hebr" typeface="Times New Roman"/>
+        <a:font script="Thai" typeface="Angsana New"/>
+        <a:font script="Ethi" typeface="Nyala"/>
+        <a:font script="Beng" typeface="Vrinda"/>
+        <a:font script="Gujr" typeface="Shruti"/>
+        <a:font script="Khmr" typeface="MoolBoran"/>
+        <a:font script="Knda" typeface="Tunga"/>
+        <a:font script="Guru" typeface="Raavi"/>
+        <a:font script="Cans" typeface="Euphemia"/>
+        <a:font script="Cher" typeface="Plantagenet Cherokee"/>
+        <a:font script="Yiii" typeface="Microsoft Yi Baiti"/>
+        <a:font script="Tibt" typeface="Microsoft Himalaya"/>
+        <a:font script="Thaa" typeface="MV Boli"/>
+        <a:font script="Deva" typeface="Mangal"/>
+        <a:font script="Telu" typeface="Gautami"/>
+        <a:font script="Taml" typeface="Latha"/>
+        <a:font script="Syrc" typeface="Estrangelo Edessa"/>
+        <a:font script="Orya" typeface="Kalinga"/>
+        <a:font script="Mlym" typeface="Kartika"/>
+        <a:font script="Laoo" typeface="DokChampa"/>
+        <a:font script="Sinh" typeface="Iskoola Pota"/>
+        <a:font script="Mong" typeface="Mongolian Baiti"/>
+        <a:font script="Viet" typeface="Times New Roman"/>
+        <a:font script="Uigh" typeface="Microsoft Uighur"/>
+        <a:font script="Geor" typeface="Sylfaen"/>
+        <a:font script="Armn" typeface="Arial"/>
+        <a:font script="Bugi" typeface="Leelawadee UI"/>
+        <a:font script="Bopo" typeface="Microsoft JhengHei"/>
+        <a:font script="Java" typeface="Javanese Text"/>
+        <a:font script="Lisu" typeface="Segoe UI"/>
+        <a:font script="Mymr" typeface="Myanmar Text"/>
+        <a:font script="Nkoo" typeface="Ebrima"/>
+        <a:font script="Olck" typeface="Nirmala UI"/>
+        <a:font script="Osma" typeface="Ebrima"/>
+        <a:font script="Phag" typeface="Phagspa"/>
+        <a:font script="Syrn" typeface="Estrangelo Edessa"/>
+        <a:font script="Syrj" typeface="Estrangelo Edessa"/>
+        <a:font script="Syre" typeface="Estrangelo Edessa"/>
+        <a:font script="Sora" typeface="Nirmala UI"/>
+        <a:font script="Tale" typeface="Microsoft Tai Le"/>
+        <a:font script="Talu" typeface="Microsoft New Tai Lue"/>
+        <a:font script="Tfng" typeface="Ebrima"/>
+      </a:majorFont>
+      <a:minorFont>
+        <a:latin typeface="Calibri" panose="020F0502020204030204"/>
+        <a:ea typeface=""/>
+        <a:cs typeface=""/>
+        <a:font script="Jpan" typeface="游明朝"/>
+        <a:font script="Hang" typeface="맑은 고딕"/>
+        <a:font script="Hans" typeface="等线"/>
+        <a:font script="Hant" typeface="新細明體"/>
+        <a:font script="Arab" typeface="Arial"/>
+        <a:font script="Hebr" typeface="Arial"/>
+        <a:font script="Thai" typeface="Cordia New"/>
+        <a:font script="Ethi" typeface="Nyala"/>
+        <a:font script="Beng" typeface="Vrinda"/>
+        <a:font script="Gujr" typeface="Shruti"/>
+        <a:font script="Khmr" typeface="DaunPenh"/>
+        <a:font script="Knda" typeface="Tunga"/>
+        <a:font script="Guru" typeface="Raavi"/>
+        <a:font script="Cans" typeface="Euphemia"/>
+        <a:font script="Cher" typeface="Plantagenet Cherokee"/>
+        <a:font script="Yiii" typeface="Microsoft Yi Baiti"/>
+        <a:font script="Tibt" typeface="Microsoft Himalaya"/>
+        <a:font script="Thaa" typeface="MV Boli"/>
+        <a:font script="Deva" typeface="Mangal"/>
+        <a:font script="Telu" typeface="Gautami"/>
+        <a:font script="Taml" typeface="Latha"/>
+        <a:font script="Syrc" typeface="Estrangelo Edessa"/>
+        <a:font script="Orya" typeface="Kalinga"/>
+        <a:font script="Mlym" typeface="Kartika"/>
+        <a:font script="Laoo" typeface="DokChampa"/>
+        <a:font script="Sinh" typeface="Iskoola Pota"/>
+        <a:font script="Mong" typeface="Mongolian Baiti"/>
+        <a:font script="Viet" typeface="Arial"/>
+        <a:font script="Uigh" typeface="Microsoft Uighur"/>
+        <a:font script="Geor" typeface="Sylfaen"/>
+        <a:font script="Armn" typeface="Arial"/>
+        <a:font script="Bugi" typeface="Leelawadee UI"/>
+        <a:font script="Bopo" typeface="Microsoft JhengHei"/>
+        <a:font script="Java" typeface="Javanese Text"/>
+        <a:font script="Lisu" typeface="Segoe UI"/>
+        <a:font script="Mymr" typeface="Myanmar Text"/>
+        <a:font script="Nkoo" typeface="Ebrima"/>
+        <a:font script="Olck" typeface="Nirmala UI"/>
+        <a:font script="Osma" typeface="Ebrima"/>
+        <a:font script="Phag" typeface="Phagspa"/>
+        <a:font script="Syrn" typeface="Estrangelo Edessa"/>
+        <a:font script="Syrj" typeface="Estrangelo Edessa"/>
+        <a:font script="Syre" typeface="Estrangelo Edessa"/>
+        <a:font script="Sora" typeface="Nirmala UI"/>
+        <a:font script="Tale" typeface="Microsoft Tai Le"/>
+        <a:font script="Talu" typeface="Microsoft New Tai Lue"/>
+        <a:font script="Tfng" typeface="Ebrima"/>
+      </a:minorFont>
+    </a:fontScheme>
+    <a:fmtScheme name="Office">
+      <a:fillStyleLst>
+        <a:solidFill>
+          <a:schemeClr val="phClr"/>
+        </a:solidFill>
+        <a:gradFill rotWithShape="1">
+          <a:gsLst>
+            <a:gs pos="0">
+              <a:schemeClr val="phClr">
+                <a:lumMod val="110000"/>
+                <a:satMod val="105000"/>
+                <a:tint val="67000"/>
+              </a:schemeClr>
+            </a:gs>
+            <a:gs pos="50000">
+              <a:schemeClr val="phClr">
+                <a:lumMod val="105000"/>
+                <a:satMod val="103000"/>
+                <a:tint val="73000"/>
+              </a:schemeClr>
+            </a:gs>
+            <a:gs pos="100000">
+              <a:schemeClr val="phClr">
+                <a:lumMod val="105000"/>
+                <a:satMod val="109000"/>
+                <a:tint val="81000"/>
+              </a:schemeClr>
+            </a:gs>
+          </a:gsLst>
+          <a:lin ang="5400000" scaled="0"/>
+        </a:gradFill>
+        <a:gradFill rotWithShape="1">
+          <a:gsLst>
+            <a:gs pos="0">
+              <a:schemeClr val="phClr">
+                <a:satMod val="103000"/>
+                <a:lumMod val="102000"/>
+                <a:tint val="94000"/>
+              </a:schemeClr>
+            </a:gs>
+            <a:gs pos="50000">
+              <a:schemeClr val="phClr">
+                <a:satMod val="110000"/>
+                <a:lumMod val="100000"/>
+                <a:shade val="100000"/>
+              </a:schemeClr>
+            </a:gs>
+            <a:gs pos="100000">
+              <a:schemeClr val="phClr">
+                <a:lumMod val="99000"/>
+                <a:satMod val="120000"/>
+                <a:shade val="78000"/>
+              </a:schemeClr>
+            </a:gs>
+          </a:gsLst>
+          <a:lin ang="5400000" scaled="0"/>
+        </a:gradFill>
+      </a:fillStyleLst>
+      <a:lnStyleLst>
+        <a:ln w="6350" cap="flat" cmpd="sng" algn="ctr">
+          <a:solidFill>
+            <a:schemeClr val="phClr"/>
+          </a:solidFill>
+          <a:prstDash val="solid"/>
+          <a:miter lim="800000"/>
+        </a:ln>
+        <a:ln w="12700" cap="flat" cmpd="sng" algn="ctr">
+          <a:solidFill>
+            <a:schemeClr val="phClr"/>
+          </a:solidFill>
+          <a:prstDash val="solid"/>
+          <a:miter lim="800000"/>
+        </a:ln>
+        <a:ln w="19050" cap="flat" cmpd="sng" algn="ctr">
+          <a:solidFill>
+            <a:schemeClr val="phClr"/>
+          </a:solidFill>
+          <a:prstDash val="solid"/>
+          <a:miter lim="800000"/>
+        </a:ln>
+      </a:lnStyleLst>
+      <a:effectStyleLst>
+        <a:effectStyle>
+          <a:effectLst/>
+        </a:effectStyle>
+        <a:effectStyle>
+          <a:effectLst/>
+        </a:effectStyle>
+        <a:effectStyle>
+          <a:effectLst>
+            <a:outerShdw blurRad="57150" dist="19050" dir="5400000" algn="ctr" rotWithShape="0">
+              <a:srgbClr val="000000">
+                <a:alpha val="63000"/>
+              </a:srgbClr>
+            </a:outerShdw>
+          </a:effectLst>
+        </a:effectStyle>
+      </a:effectStyleLst>
+      <a:bgFillStyleLst>
+        <a:solidFill>
+          <a:schemeClr val="phClr"/>
+        </a:solidFill>
+        <a:solidFill>
+          <a:schemeClr val="phClr">
+            <a:tint val="95000"/>
+            <a:satMod val="170000"/>
+          </a:schemeClr>
+        </a:solidFill>
+        <a:gradFill rotWithShape="1">
+          <a:gsLst>
+            <a:gs pos="0">
+              <a:schemeClr val="phClr">
+                <a:tint val="93000"/>
+                <a:satMod val="150000"/>
+                <a:shade val="98000"/>
+                <a:lumMod val="102000"/>
+              </a:schemeClr>
+            </a:gs>
+            <a:gs pos="50000">
+              <a:schemeClr val="phClr">
+                <a:tint val="98000"/>
+                <a:satMod val="130000"/>
+                <a:shade val="90000"/>
+                <a:lumMod val="103000"/>
+              </a:schemeClr>
+            </a:gs>
+            <a:gs pos="100000">
+              <a:schemeClr val="phClr">
+                <a:shade val="63000"/>
+                <a:satMod val="120000"/>
+              </a:schemeClr>
+            </a:gs>
+          </a:gsLst>
+          <a:lin ang="5400000" scaled="0"/>
+        </a:gradFill>
+      </a:bgFillStyleLst>
+    </a:fmtScheme>
+  </a:themeElements>
+  <a:objectDefaults/>
+  <a:extraClrSchemeLst/>
+  <a:extLst>
+    <a:ext uri="{05A4C25C-085E-4340-85A3-A5531E510DB2}">
+      <thm15:themeFamily xmlns:thm15="http://schemas.microsoft.com/office/thememl/2012/main" name="Office Theme" id="{62F939B6-93AF-4DB8-9C6B-D6C7DFDC589F}" vid="{4A3C46E8-61CC-4603-A589-7422A47A8E4A}"/>
+    </a:ext>
+  </a:extLst>
+</a:theme>
 </file>
</xml_diff>